<commit_message>
134 desarrollar pruebas de la webcompra (#144)
* pruebas funcionando perfectamente

* he añadido el word explicando las pruebas

* 11 PRUEBAS HECHAS Y FUNCIONANDO BIEN (si no le va a alguien es porque no tiene la misma base de datos que yo), asi que si me teneis que corregir puedo pasaros un script para meter todo (en caso de que no este que espero que si)

* se me olvidó cambiar el word con la explicacion de las pruebas xd
</commit_message>
<xml_diff>
--- a/test/AppForSEII2526.UIT/Compra_test/TC_CU_Compra.docx
+++ b/test/AppForSEII2526.UIT/Compra_test/TC_CU_Compra.docx
@@ -300,6 +300,12 @@
                 <w:lang w:val="es-ES"/>
               </w:rPr>
             </w:pPr>
+            <w:r>
+              <w:rPr>
+                <w:lang w:val="es-ES"/>
+              </w:rPr>
+              <w:t>14/12/2025</w:t>
+            </w:r>
           </w:p>
         </w:tc>
         <w:tc>
@@ -313,6 +319,12 @@
                 <w:lang w:val="es-ES"/>
               </w:rPr>
             </w:pPr>
+            <w:r>
+              <w:rPr>
+                <w:lang w:val="es-ES"/>
+              </w:rPr>
+              <w:t>1.0</w:t>
+            </w:r>
           </w:p>
         </w:tc>
         <w:tc>
@@ -326,6 +338,12 @@
                 <w:lang w:val="es-ES"/>
               </w:rPr>
             </w:pPr>
+            <w:r>
+              <w:rPr>
+                <w:lang w:val="es-ES"/>
+              </w:rPr>
+              <w:t>4 pruebas creadas</w:t>
+            </w:r>
           </w:p>
         </w:tc>
         <w:tc>
@@ -339,6 +357,12 @@
                 <w:lang w:val="es-ES"/>
               </w:rPr>
             </w:pPr>
+            <w:r>
+              <w:rPr>
+                <w:lang w:val="es-ES"/>
+              </w:rPr>
+              <w:t>Daniel García</w:t>
+            </w:r>
           </w:p>
         </w:tc>
       </w:tr>
@@ -354,6 +378,12 @@
                 <w:lang w:val="es-ES"/>
               </w:rPr>
             </w:pPr>
+            <w:r>
+              <w:rPr>
+                <w:lang w:val="es-ES"/>
+              </w:rPr>
+              <w:t>15/12/2025</w:t>
+            </w:r>
           </w:p>
         </w:tc>
         <w:tc>
@@ -367,6 +397,12 @@
                 <w:lang w:val="es-ES"/>
               </w:rPr>
             </w:pPr>
+            <w:r>
+              <w:rPr>
+                <w:lang w:val="es-ES"/>
+              </w:rPr>
+              <w:t>1.1</w:t>
+            </w:r>
           </w:p>
         </w:tc>
         <w:tc>
@@ -380,6 +416,34 @@
                 <w:lang w:val="en-GB"/>
               </w:rPr>
             </w:pPr>
+            <w:r>
+              <w:rPr>
+                <w:lang w:val="en-GB"/>
+              </w:rPr>
+              <w:t xml:space="preserve">11 </w:t>
+            </w:r>
+            <w:proofErr w:type="spellStart"/>
+            <w:r>
+              <w:rPr>
+                <w:lang w:val="en-GB"/>
+              </w:rPr>
+              <w:t>pruebas</w:t>
+            </w:r>
+            <w:proofErr w:type="spellEnd"/>
+            <w:r>
+              <w:rPr>
+                <w:lang w:val="en-GB"/>
+              </w:rPr>
+              <w:t xml:space="preserve"> </w:t>
+            </w:r>
+            <w:proofErr w:type="spellStart"/>
+            <w:r>
+              <w:rPr>
+                <w:lang w:val="en-GB"/>
+              </w:rPr>
+              <w:t>creadas</w:t>
+            </w:r>
+            <w:proofErr w:type="spellEnd"/>
           </w:p>
         </w:tc>
         <w:tc>
@@ -393,6 +457,12 @@
                 <w:lang w:val="es-ES"/>
               </w:rPr>
             </w:pPr>
+            <w:r>
+              <w:rPr>
+                <w:lang w:val="es-ES"/>
+              </w:rPr>
+              <w:t>Daniel García</w:t>
+            </w:r>
           </w:p>
         </w:tc>
       </w:tr>
@@ -1322,16 +1392,20 @@
         <w:tc>
           <w:tcPr>
             <w:tcW w:w="1252" w:type="dxa"/>
-          </w:tcPr>
-          <w:p>
-            <w:pPr>
-              <w:rPr>
-                <w:lang w:val="es-ES"/>
-              </w:rPr>
-            </w:pPr>
-            <w:r>
-              <w:rPr>
-                <w:lang w:val="es-ES"/>
+            <w:vAlign w:val="center"/>
+          </w:tcPr>
+          <w:p>
+            <w:pPr>
+              <w:rPr>
+                <w:lang w:val="es-ES"/>
+              </w:rPr>
+            </w:pPr>
+            <w:r>
+              <w:rPr>
+                <w:rStyle w:val="Textoennegrita"/>
+                <w:rFonts w:cs="Arial"/>
+                <w:color w:val="1F1F1F"/>
+                <w:bdr w:val="none" w:sz="0" w:space="0" w:color="auto" w:frame="1"/>
               </w:rPr>
               <w:t>Id-TC</w:t>
             </w:r>
@@ -1340,37 +1414,49 @@
         <w:tc>
           <w:tcPr>
             <w:tcW w:w="2036" w:type="dxa"/>
-          </w:tcPr>
-          <w:p>
-            <w:pPr>
-              <w:rPr>
-                <w:lang w:val="es-ES"/>
-              </w:rPr>
-            </w:pPr>
-            <w:r>
-              <w:rPr>
-                <w:lang w:val="es-ES"/>
+            <w:vAlign w:val="center"/>
+          </w:tcPr>
+          <w:p>
+            <w:pPr>
+              <w:rPr>
+                <w:lang w:val="es-ES"/>
+              </w:rPr>
+            </w:pPr>
+            <w:proofErr w:type="spellStart"/>
+            <w:r>
+              <w:rPr>
+                <w:rStyle w:val="Textoennegrita"/>
+                <w:rFonts w:cs="Arial"/>
+                <w:color w:val="1F1F1F"/>
+                <w:bdr w:val="none" w:sz="0" w:space="0" w:color="auto" w:frame="1"/>
               </w:rPr>
               <w:t>Escenario</w:t>
             </w:r>
+            <w:proofErr w:type="spellEnd"/>
           </w:p>
         </w:tc>
         <w:tc>
           <w:tcPr>
             <w:tcW w:w="1262" w:type="dxa"/>
-          </w:tcPr>
-          <w:p>
-            <w:pPr>
-              <w:rPr>
-                <w:lang w:val="es-ES"/>
-              </w:rPr>
-            </w:pPr>
-            <w:r>
-              <w:rPr>
-                <w:lang w:val="es-ES"/>
+            <w:vAlign w:val="center"/>
+          </w:tcPr>
+          <w:p>
+            <w:pPr>
+              <w:rPr>
+                <w:lang w:val="es-ES"/>
+              </w:rPr>
+            </w:pPr>
+            <w:proofErr w:type="spellStart"/>
+            <w:r>
+              <w:rPr>
+                <w:rStyle w:val="Textoennegrita"/>
+                <w:rFonts w:cs="Arial"/>
+                <w:color w:val="1F1F1F"/>
+                <w:bdr w:val="none" w:sz="0" w:space="0" w:color="auto" w:frame="1"/>
               </w:rPr>
               <w:t>Flujo</w:t>
             </w:r>
+            <w:proofErr w:type="spellEnd"/>
           </w:p>
         </w:tc>
       </w:tr>
@@ -1378,16 +1464,21 @@
         <w:tc>
           <w:tcPr>
             <w:tcW w:w="1252" w:type="dxa"/>
-          </w:tcPr>
-          <w:p>
-            <w:pPr>
-              <w:rPr>
-                <w:lang w:val="es-ES"/>
-              </w:rPr>
-            </w:pPr>
-            <w:r>
-              <w:rPr>
-                <w:lang w:val="es-ES"/>
+            <w:vAlign w:val="center"/>
+          </w:tcPr>
+          <w:p>
+            <w:pPr>
+              <w:rPr>
+                <w:lang w:val="es-ES"/>
+              </w:rPr>
+            </w:pPr>
+            <w:r>
+              <w:rPr>
+                <w:rFonts w:ascii="Arial" w:hAnsi="Arial" w:cs="Arial"/>
+                <w:b/>
+                <w:bCs/>
+                <w:color w:val="1F1F1F"/>
+                <w:bdr w:val="none" w:sz="0" w:space="0" w:color="auto" w:frame="1"/>
               </w:rPr>
               <w:t>Esc-1</w:t>
             </w:r>
@@ -1396,49 +1487,101 @@
         <w:tc>
           <w:tcPr>
             <w:tcW w:w="2036" w:type="dxa"/>
-          </w:tcPr>
-          <w:p>
-            <w:pPr>
-              <w:rPr>
-                <w:lang w:val="es-ES"/>
-              </w:rPr>
-            </w:pPr>
-            <w:proofErr w:type="spellStart"/>
-            <w:r>
-              <w:t>Compra</w:t>
-            </w:r>
-            <w:proofErr w:type="spellEnd"/>
-            <w:r>
+            <w:vAlign w:val="center"/>
+          </w:tcPr>
+          <w:p>
+            <w:pPr>
+              <w:pStyle w:val="NormalWeb"/>
+              <w:spacing w:before="0" w:beforeAutospacing="0" w:after="0" w:afterAutospacing="0"/>
+              <w:rPr>
+                <w:rFonts w:ascii="Arial" w:hAnsi="Arial" w:cs="Arial"/>
+                <w:color w:val="1F1F1F"/>
+              </w:rPr>
+            </w:pPr>
+            <w:r>
+              <w:rPr>
+                <w:rFonts w:ascii="Arial" w:hAnsi="Arial" w:cs="Arial"/>
+                <w:b/>
+                <w:bCs/>
+                <w:color w:val="1F1F1F"/>
+                <w:bdr w:val="none" w:sz="0" w:space="0" w:color="auto" w:frame="1"/>
+              </w:rPr>
+              <w:t xml:space="preserve">Compra completa </w:t>
+            </w:r>
+            <w:proofErr w:type="gramStart"/>
+            <w:r>
+              <w:rPr>
+                <w:rFonts w:ascii="Arial" w:hAnsi="Arial" w:cs="Arial"/>
+                <w:b/>
+                <w:bCs/>
+                <w:color w:val="1F1F1F"/>
+                <w:bdr w:val="none" w:sz="0" w:space="0" w:color="auto" w:frame="1"/>
+              </w:rPr>
+              <w:t xml:space="preserve">con </w:t>
+            </w:r>
+            <w:r>
+              <w:rPr>
+                <w:rFonts w:ascii="Arial" w:hAnsi="Arial" w:cs="Arial"/>
+                <w:b/>
+                <w:bCs/>
+                <w:color w:val="1F1F1F"/>
+                <w:bdr w:val="none" w:sz="0" w:space="0" w:color="auto" w:frame="1"/>
+              </w:rPr>
               <w:t xml:space="preserve"> </w:t>
             </w:r>
-            <w:proofErr w:type="spellStart"/>
-            <w:r>
-              <w:t>realizada</w:t>
-            </w:r>
-            <w:proofErr w:type="spellEnd"/>
-            <w:r>
-              <w:t xml:space="preserve"> con </w:t>
-            </w:r>
-            <w:proofErr w:type="spellStart"/>
-            <w:r>
+            <w:r>
+              <w:rPr>
+                <w:rFonts w:ascii="Arial" w:hAnsi="Arial" w:cs="Arial"/>
+                <w:b/>
+                <w:bCs/>
+                <w:color w:val="1F1F1F"/>
+                <w:bdr w:val="none" w:sz="0" w:space="0" w:color="auto" w:frame="1"/>
+              </w:rPr>
               <w:t>éxito</w:t>
             </w:r>
-            <w:proofErr w:type="spellEnd"/>
+            <w:proofErr w:type="gramEnd"/>
+          </w:p>
+          <w:p>
+            <w:pPr>
+              <w:rPr>
+                <w:rFonts w:ascii="Arial" w:hAnsi="Arial" w:cs="Arial"/>
+                <w:color w:val="1F1F1F"/>
+              </w:rPr>
+            </w:pPr>
+            <w:r>
+              <w:rPr>
+                <w:rFonts w:ascii="Arial" w:hAnsi="Arial" w:cs="Arial"/>
+                <w:color w:val="1F1F1F"/>
+              </w:rPr>
+              <w:br/>
+            </w:r>
+          </w:p>
+          <w:p>
+            <w:pPr>
+              <w:rPr>
+                <w:lang w:val="es-ES"/>
+              </w:rPr>
+            </w:pPr>
           </w:p>
         </w:tc>
         <w:tc>
           <w:tcPr>
             <w:tcW w:w="1262" w:type="dxa"/>
-          </w:tcPr>
-          <w:p>
-            <w:pPr>
-              <w:rPr>
-                <w:lang w:val="es-ES"/>
-              </w:rPr>
-            </w:pPr>
-            <w:r>
-              <w:rPr>
-                <w:lang w:val="es-ES"/>
+            <w:vAlign w:val="center"/>
+          </w:tcPr>
+          <w:p>
+            <w:pPr>
+              <w:rPr>
+                <w:lang w:val="es-ES"/>
+              </w:rPr>
+            </w:pPr>
+            <w:r>
+              <w:rPr>
+                <w:rFonts w:ascii="Arial" w:hAnsi="Arial" w:cs="Arial"/>
+                <w:b/>
+                <w:bCs/>
+                <w:color w:val="1F1F1F"/>
+                <w:bdr w:val="none" w:sz="0" w:space="0" w:color="auto" w:frame="1"/>
               </w:rPr>
               <w:t>FB</w:t>
             </w:r>
@@ -1449,16 +1592,21 @@
         <w:tc>
           <w:tcPr>
             <w:tcW w:w="1252" w:type="dxa"/>
-          </w:tcPr>
-          <w:p>
-            <w:pPr>
-              <w:rPr>
-                <w:lang w:val="es-ES"/>
-              </w:rPr>
-            </w:pPr>
-            <w:r>
-              <w:rPr>
-                <w:lang w:val="es-ES"/>
+            <w:vAlign w:val="center"/>
+          </w:tcPr>
+          <w:p>
+            <w:pPr>
+              <w:rPr>
+                <w:lang w:val="es-ES"/>
+              </w:rPr>
+            </w:pPr>
+            <w:r>
+              <w:rPr>
+                <w:rFonts w:ascii="Arial" w:hAnsi="Arial" w:cs="Arial"/>
+                <w:b/>
+                <w:bCs/>
+                <w:color w:val="1F1F1F"/>
+                <w:bdr w:val="none" w:sz="0" w:space="0" w:color="auto" w:frame="1"/>
               </w:rPr>
               <w:t>Esc-2</w:t>
             </w:r>
@@ -1467,34 +1615,69 @@
         <w:tc>
           <w:tcPr>
             <w:tcW w:w="2036" w:type="dxa"/>
-          </w:tcPr>
-          <w:p>
-            <w:pPr>
-              <w:rPr>
-                <w:lang w:val="es-ES"/>
-              </w:rPr>
-            </w:pPr>
-            <w:r>
-              <w:rPr>
-                <w:lang w:val="es-ES"/>
-              </w:rPr>
-              <w:t>Filtrar herramientas</w:t>
-            </w:r>
+            <w:vAlign w:val="center"/>
+          </w:tcPr>
+          <w:p>
+            <w:pPr>
+              <w:pStyle w:val="NormalWeb"/>
+              <w:spacing w:before="0" w:beforeAutospacing="0" w:after="0" w:afterAutospacing="0"/>
+              <w:rPr>
+                <w:rFonts w:ascii="Arial" w:hAnsi="Arial" w:cs="Arial"/>
+                <w:color w:val="1F1F1F"/>
+              </w:rPr>
+            </w:pPr>
+            <w:r>
+              <w:rPr>
+                <w:rFonts w:ascii="Arial" w:hAnsi="Arial" w:cs="Arial"/>
+                <w:b/>
+                <w:bCs/>
+                <w:color w:val="1F1F1F"/>
+                <w:bdr w:val="none" w:sz="0" w:space="0" w:color="auto" w:frame="1"/>
+              </w:rPr>
+              <w:t>Filtrado de herramientas</w:t>
+            </w:r>
+          </w:p>
+          <w:p>
+            <w:pPr>
+              <w:rPr>
+                <w:rFonts w:ascii="Arial" w:hAnsi="Arial" w:cs="Arial"/>
+                <w:color w:val="1F1F1F"/>
+              </w:rPr>
+            </w:pPr>
+            <w:r>
+              <w:rPr>
+                <w:rFonts w:ascii="Arial" w:hAnsi="Arial" w:cs="Arial"/>
+                <w:color w:val="1F1F1F"/>
+              </w:rPr>
+              <w:br/>
+            </w:r>
+          </w:p>
+          <w:p>
+            <w:pPr>
+              <w:rPr>
+                <w:lang w:val="es-ES"/>
+              </w:rPr>
+            </w:pPr>
           </w:p>
         </w:tc>
         <w:tc>
           <w:tcPr>
             <w:tcW w:w="1262" w:type="dxa"/>
-          </w:tcPr>
-          <w:p>
-            <w:pPr>
-              <w:rPr>
-                <w:lang w:val="es-ES"/>
-              </w:rPr>
-            </w:pPr>
-            <w:r>
-              <w:rPr>
-                <w:lang w:val="es-ES"/>
+            <w:vAlign w:val="center"/>
+          </w:tcPr>
+          <w:p>
+            <w:pPr>
+              <w:rPr>
+                <w:lang w:val="es-ES"/>
+              </w:rPr>
+            </w:pPr>
+            <w:r>
+              <w:rPr>
+                <w:rFonts w:ascii="Arial" w:hAnsi="Arial" w:cs="Arial"/>
+                <w:b/>
+                <w:bCs/>
+                <w:color w:val="1F1F1F"/>
+                <w:bdr w:val="none" w:sz="0" w:space="0" w:color="auto" w:frame="1"/>
               </w:rPr>
               <w:t>FB + FA0</w:t>
             </w:r>
@@ -1505,16 +1688,21 @@
         <w:tc>
           <w:tcPr>
             <w:tcW w:w="1252" w:type="dxa"/>
-          </w:tcPr>
-          <w:p>
-            <w:pPr>
-              <w:rPr>
-                <w:lang w:val="es-ES"/>
-              </w:rPr>
-            </w:pPr>
-            <w:r>
-              <w:rPr>
-                <w:lang w:val="es-ES"/>
+            <w:vAlign w:val="center"/>
+          </w:tcPr>
+          <w:p>
+            <w:pPr>
+              <w:rPr>
+                <w:lang w:val="es-ES"/>
+              </w:rPr>
+            </w:pPr>
+            <w:r>
+              <w:rPr>
+                <w:rFonts w:ascii="Arial" w:hAnsi="Arial" w:cs="Arial"/>
+                <w:b/>
+                <w:bCs/>
+                <w:color w:val="1F1F1F"/>
+                <w:bdr w:val="none" w:sz="0" w:space="0" w:color="auto" w:frame="1"/>
               </w:rPr>
               <w:t>Esc-3</w:t>
             </w:r>
@@ -1523,44 +1711,71 @@
         <w:tc>
           <w:tcPr>
             <w:tcW w:w="2036" w:type="dxa"/>
-          </w:tcPr>
-          <w:p>
-            <w:pPr>
-              <w:rPr>
-                <w:lang w:val="es-ES"/>
-              </w:rPr>
-            </w:pPr>
-            <w:r>
-              <w:t xml:space="preserve">Datos </w:t>
-            </w:r>
-            <w:proofErr w:type="spellStart"/>
-            <w:r>
-              <w:t>incorrectos</w:t>
-            </w:r>
-            <w:proofErr w:type="spellEnd"/>
-            <w:r>
-              <w:t>/</w:t>
-            </w:r>
-            <w:proofErr w:type="spellStart"/>
-            <w:r>
-              <w:t>vacíos</w:t>
-            </w:r>
-            <w:proofErr w:type="spellEnd"/>
+            <w:vAlign w:val="center"/>
+          </w:tcPr>
+          <w:p>
+            <w:pPr>
+              <w:pStyle w:val="NormalWeb"/>
+              <w:spacing w:before="0" w:beforeAutospacing="0" w:after="0" w:afterAutospacing="0"/>
+              <w:rPr>
+                <w:rFonts w:ascii="Arial" w:hAnsi="Arial" w:cs="Arial"/>
+                <w:color w:val="1F1F1F"/>
+              </w:rPr>
+            </w:pPr>
+            <w:r>
+              <w:rPr>
+                <w:rFonts w:ascii="Arial" w:hAnsi="Arial" w:cs="Arial"/>
+                <w:b/>
+                <w:bCs/>
+                <w:color w:val="1F1F1F"/>
+                <w:bdr w:val="none" w:sz="0" w:space="0" w:color="auto" w:frame="1"/>
+              </w:rPr>
+              <w:t>Validación de Datos Personales</w:t>
+            </w:r>
+          </w:p>
+          <w:p>
+            <w:pPr>
+              <w:rPr>
+                <w:rFonts w:ascii="Arial" w:hAnsi="Arial" w:cs="Arial"/>
+                <w:color w:val="1F1F1F"/>
+                <w:lang w:val="es-ES"/>
+              </w:rPr>
+            </w:pPr>
+            <w:r>
+              <w:rPr>
+                <w:rFonts w:ascii="Arial" w:hAnsi="Arial" w:cs="Arial"/>
+                <w:color w:val="1F1F1F"/>
+                <w:lang w:val="es-ES"/>
+              </w:rPr>
+              <w:br/>
+            </w:r>
+          </w:p>
+          <w:p>
+            <w:pPr>
+              <w:rPr>
+                <w:lang w:val="es-ES"/>
+              </w:rPr>
+            </w:pPr>
           </w:p>
         </w:tc>
         <w:tc>
           <w:tcPr>
             <w:tcW w:w="1262" w:type="dxa"/>
-          </w:tcPr>
-          <w:p>
-            <w:pPr>
-              <w:rPr>
-                <w:lang w:val="es-ES"/>
-              </w:rPr>
-            </w:pPr>
-            <w:r>
-              <w:rPr>
-                <w:lang w:val="es-ES"/>
+            <w:vAlign w:val="center"/>
+          </w:tcPr>
+          <w:p>
+            <w:pPr>
+              <w:rPr>
+                <w:lang w:val="es-ES"/>
+              </w:rPr>
+            </w:pPr>
+            <w:r>
+              <w:rPr>
+                <w:rFonts w:ascii="Arial" w:hAnsi="Arial" w:cs="Arial"/>
+                <w:b/>
+                <w:bCs/>
+                <w:color w:val="1F1F1F"/>
+                <w:bdr w:val="none" w:sz="0" w:space="0" w:color="auto" w:frame="1"/>
               </w:rPr>
               <w:t>FB + FA1</w:t>
             </w:r>
@@ -1571,16 +1786,21 @@
         <w:tc>
           <w:tcPr>
             <w:tcW w:w="1252" w:type="dxa"/>
-          </w:tcPr>
-          <w:p>
-            <w:pPr>
-              <w:rPr>
-                <w:lang w:val="es-ES"/>
-              </w:rPr>
-            </w:pPr>
-            <w:r>
-              <w:rPr>
-                <w:lang w:val="es-ES"/>
+            <w:vAlign w:val="center"/>
+          </w:tcPr>
+          <w:p>
+            <w:pPr>
+              <w:rPr>
+                <w:lang w:val="es-ES"/>
+              </w:rPr>
+            </w:pPr>
+            <w:r>
+              <w:rPr>
+                <w:rFonts w:ascii="Arial" w:hAnsi="Arial" w:cs="Arial"/>
+                <w:b/>
+                <w:bCs/>
+                <w:color w:val="1F1F1F"/>
+                <w:bdr w:val="none" w:sz="0" w:space="0" w:color="auto" w:frame="1"/>
               </w:rPr>
               <w:t>Esc-4</w:t>
             </w:r>
@@ -1589,34 +1809,71 @@
         <w:tc>
           <w:tcPr>
             <w:tcW w:w="2036" w:type="dxa"/>
-          </w:tcPr>
-          <w:p>
-            <w:pPr>
-              <w:rPr>
-                <w:lang w:val="es-ES"/>
-              </w:rPr>
-            </w:pPr>
-            <w:r>
-              <w:rPr>
-                <w:lang w:val="es-ES"/>
-              </w:rPr>
-              <w:t>Modificar herramientas ofertadas</w:t>
-            </w:r>
+            <w:vAlign w:val="center"/>
+          </w:tcPr>
+          <w:p>
+            <w:pPr>
+              <w:pStyle w:val="NormalWeb"/>
+              <w:spacing w:before="0" w:beforeAutospacing="0" w:after="0" w:afterAutospacing="0"/>
+              <w:rPr>
+                <w:rFonts w:ascii="Arial" w:hAnsi="Arial" w:cs="Arial"/>
+                <w:color w:val="1F1F1F"/>
+              </w:rPr>
+            </w:pPr>
+            <w:r>
+              <w:rPr>
+                <w:rFonts w:ascii="Arial" w:hAnsi="Arial" w:cs="Arial"/>
+                <w:b/>
+                <w:bCs/>
+                <w:color w:val="1F1F1F"/>
+                <w:bdr w:val="none" w:sz="0" w:space="0" w:color="auto" w:frame="1"/>
+              </w:rPr>
+              <w:t>Gestión del Carrito</w:t>
+            </w:r>
+          </w:p>
+          <w:p>
+            <w:pPr>
+              <w:rPr>
+                <w:rFonts w:ascii="Arial" w:hAnsi="Arial" w:cs="Arial"/>
+                <w:color w:val="1F1F1F"/>
+                <w:lang w:val="es-ES"/>
+              </w:rPr>
+            </w:pPr>
+            <w:r>
+              <w:rPr>
+                <w:rFonts w:ascii="Arial" w:hAnsi="Arial" w:cs="Arial"/>
+                <w:color w:val="1F1F1F"/>
+                <w:lang w:val="es-ES"/>
+              </w:rPr>
+              <w:br/>
+            </w:r>
+          </w:p>
+          <w:p>
+            <w:pPr>
+              <w:rPr>
+                <w:lang w:val="es-ES"/>
+              </w:rPr>
+            </w:pPr>
           </w:p>
         </w:tc>
         <w:tc>
           <w:tcPr>
             <w:tcW w:w="1262" w:type="dxa"/>
-          </w:tcPr>
-          <w:p>
-            <w:pPr>
-              <w:rPr>
-                <w:lang w:val="es-ES"/>
-              </w:rPr>
-            </w:pPr>
-            <w:r>
-              <w:rPr>
-                <w:lang w:val="es-ES"/>
+            <w:vAlign w:val="center"/>
+          </w:tcPr>
+          <w:p>
+            <w:pPr>
+              <w:rPr>
+                <w:lang w:val="es-ES"/>
+              </w:rPr>
+            </w:pPr>
+            <w:r>
+              <w:rPr>
+                <w:rFonts w:ascii="Arial" w:hAnsi="Arial" w:cs="Arial"/>
+                <w:b/>
+                <w:bCs/>
+                <w:color w:val="1F1F1F"/>
+                <w:bdr w:val="none" w:sz="0" w:space="0" w:color="auto" w:frame="1"/>
               </w:rPr>
               <w:t>FB + FA2</w:t>
             </w:r>
@@ -1627,16 +1884,21 @@
         <w:tc>
           <w:tcPr>
             <w:tcW w:w="1252" w:type="dxa"/>
-          </w:tcPr>
-          <w:p>
-            <w:pPr>
-              <w:rPr>
-                <w:lang w:val="es-ES"/>
-              </w:rPr>
-            </w:pPr>
-            <w:r>
-              <w:rPr>
-                <w:lang w:val="es-ES"/>
+            <w:vAlign w:val="center"/>
+          </w:tcPr>
+          <w:p>
+            <w:pPr>
+              <w:rPr>
+                <w:lang w:val="es-ES"/>
+              </w:rPr>
+            </w:pPr>
+            <w:r>
+              <w:rPr>
+                <w:rFonts w:ascii="Arial" w:hAnsi="Arial" w:cs="Arial"/>
+                <w:b/>
+                <w:bCs/>
+                <w:color w:val="1F1F1F"/>
+                <w:bdr w:val="none" w:sz="0" w:space="0" w:color="auto" w:frame="1"/>
               </w:rPr>
               <w:t>Esc-5</w:t>
             </w:r>
@@ -1645,49 +1907,71 @@
         <w:tc>
           <w:tcPr>
             <w:tcW w:w="2036" w:type="dxa"/>
-          </w:tcPr>
-          <w:p>
-            <w:pPr>
-              <w:rPr>
-                <w:lang w:val="es-ES"/>
-              </w:rPr>
-            </w:pPr>
-            <w:proofErr w:type="spellStart"/>
-            <w:r>
-              <w:t>Modificar</w:t>
-            </w:r>
-            <w:proofErr w:type="spellEnd"/>
-            <w:r>
-              <w:t xml:space="preserve"> </w:t>
-            </w:r>
-            <w:proofErr w:type="spellStart"/>
-            <w:r>
-              <w:t>carrito</w:t>
-            </w:r>
-            <w:proofErr w:type="spellEnd"/>
-            <w:r>
-              <w:t xml:space="preserve"> de </w:t>
-            </w:r>
-            <w:proofErr w:type="spellStart"/>
-            <w:r>
-              <w:t>compra</w:t>
-            </w:r>
-            <w:proofErr w:type="spellEnd"/>
+            <w:vAlign w:val="center"/>
+          </w:tcPr>
+          <w:p>
+            <w:pPr>
+              <w:pStyle w:val="NormalWeb"/>
+              <w:spacing w:before="0" w:beforeAutospacing="0" w:after="0" w:afterAutospacing="0"/>
+              <w:rPr>
+                <w:rFonts w:ascii="Arial" w:hAnsi="Arial" w:cs="Arial"/>
+                <w:color w:val="1F1F1F"/>
+              </w:rPr>
+            </w:pPr>
+            <w:r>
+              <w:rPr>
+                <w:rFonts w:ascii="Arial" w:hAnsi="Arial" w:cs="Arial"/>
+                <w:b/>
+                <w:bCs/>
+                <w:color w:val="1F1F1F"/>
+                <w:bdr w:val="none" w:sz="0" w:space="0" w:color="auto" w:frame="1"/>
+              </w:rPr>
+              <w:t>Validación de Datos de Herramienta</w:t>
+            </w:r>
+          </w:p>
+          <w:p>
+            <w:pPr>
+              <w:rPr>
+                <w:rFonts w:ascii="Arial" w:hAnsi="Arial" w:cs="Arial"/>
+                <w:color w:val="1F1F1F"/>
+                <w:lang w:val="es-ES"/>
+              </w:rPr>
+            </w:pPr>
+            <w:r>
+              <w:rPr>
+                <w:rFonts w:ascii="Arial" w:hAnsi="Arial" w:cs="Arial"/>
+                <w:color w:val="1F1F1F"/>
+                <w:lang w:val="es-ES"/>
+              </w:rPr>
+              <w:br/>
+            </w:r>
+          </w:p>
+          <w:p>
+            <w:pPr>
+              <w:rPr>
+                <w:lang w:val="es-ES"/>
+              </w:rPr>
+            </w:pPr>
           </w:p>
         </w:tc>
         <w:tc>
           <w:tcPr>
             <w:tcW w:w="1262" w:type="dxa"/>
-          </w:tcPr>
-          <w:p>
-            <w:pPr>
-              <w:rPr>
-                <w:lang w:val="es-ES"/>
-              </w:rPr>
-            </w:pPr>
-            <w:r>
-              <w:rPr>
-                <w:lang w:val="es-ES"/>
+            <w:vAlign w:val="center"/>
+          </w:tcPr>
+          <w:p>
+            <w:pPr>
+              <w:rPr>
+                <w:lang w:val="es-ES"/>
+              </w:rPr>
+            </w:pPr>
+            <w:r>
+              <w:rPr>
+                <w:rFonts w:ascii="Arial" w:hAnsi="Arial" w:cs="Arial"/>
+                <w:b/>
+                <w:bCs/>
+                <w:color w:val="1F1F1F"/>
+                <w:bdr w:val="none" w:sz="0" w:space="0" w:color="auto" w:frame="1"/>
               </w:rPr>
               <w:t>FB + FA3</w:t>
             </w:r>
@@ -1808,6 +2092,132 @@
     </w:p>
     <w:p>
       <w:pPr>
+        <w:rPr>
+          <w:lang w:val="es-ES"/>
+        </w:rPr>
+      </w:pPr>
+    </w:p>
+    <w:p>
+      <w:pPr>
+        <w:rPr>
+          <w:lang w:val="es-ES"/>
+        </w:rPr>
+      </w:pPr>
+    </w:p>
+    <w:p>
+      <w:pPr>
+        <w:rPr>
+          <w:lang w:val="es-ES"/>
+        </w:rPr>
+      </w:pPr>
+    </w:p>
+    <w:p>
+      <w:pPr>
+        <w:rPr>
+          <w:lang w:val="es-ES"/>
+        </w:rPr>
+      </w:pPr>
+    </w:p>
+    <w:p>
+      <w:pPr>
+        <w:rPr>
+          <w:lang w:val="es-ES"/>
+        </w:rPr>
+      </w:pPr>
+    </w:p>
+    <w:p>
+      <w:pPr>
+        <w:rPr>
+          <w:lang w:val="es-ES"/>
+        </w:rPr>
+      </w:pPr>
+    </w:p>
+    <w:p>
+      <w:pPr>
+        <w:rPr>
+          <w:lang w:val="es-ES"/>
+        </w:rPr>
+      </w:pPr>
+    </w:p>
+    <w:p>
+      <w:pPr>
+        <w:rPr>
+          <w:lang w:val="es-ES"/>
+        </w:rPr>
+      </w:pPr>
+    </w:p>
+    <w:p>
+      <w:pPr>
+        <w:rPr>
+          <w:lang w:val="es-ES"/>
+        </w:rPr>
+      </w:pPr>
+    </w:p>
+    <w:p>
+      <w:pPr>
+        <w:rPr>
+          <w:lang w:val="es-ES"/>
+        </w:rPr>
+      </w:pPr>
+    </w:p>
+    <w:p>
+      <w:pPr>
+        <w:rPr>
+          <w:lang w:val="es-ES"/>
+        </w:rPr>
+      </w:pPr>
+    </w:p>
+    <w:p>
+      <w:pPr>
+        <w:rPr>
+          <w:lang w:val="es-ES"/>
+        </w:rPr>
+      </w:pPr>
+    </w:p>
+    <w:p>
+      <w:pPr>
+        <w:rPr>
+          <w:lang w:val="es-ES"/>
+        </w:rPr>
+      </w:pPr>
+    </w:p>
+    <w:p>
+      <w:pPr>
+        <w:rPr>
+          <w:lang w:val="es-ES"/>
+        </w:rPr>
+      </w:pPr>
+    </w:p>
+    <w:p>
+      <w:pPr>
+        <w:rPr>
+          <w:lang w:val="es-ES"/>
+        </w:rPr>
+      </w:pPr>
+    </w:p>
+    <w:p>
+      <w:pPr>
+        <w:rPr>
+          <w:lang w:val="es-ES"/>
+        </w:rPr>
+      </w:pPr>
+    </w:p>
+    <w:p>
+      <w:pPr>
+        <w:rPr>
+          <w:lang w:val="es-ES"/>
+        </w:rPr>
+      </w:pPr>
+    </w:p>
+    <w:p>
+      <w:pPr>
+        <w:rPr>
+          <w:lang w:val="es-ES"/>
+        </w:rPr>
+      </w:pPr>
+    </w:p>
+    <w:p>
+      <w:pPr>
         <w:pStyle w:val="Ttulo1"/>
         <w:rPr>
           <w:lang w:val="es-ES"/>
@@ -1844,309 +2254,578 @@
     </w:p>
     <w:tbl>
       <w:tblPr>
-        <w:tblStyle w:val="Tablaconcuadrcula"/>
         <w:tblW w:w="0" w:type="auto"/>
-        <w:tblInd w:w="38" w:type="dxa"/>
+        <w:tblCellSpacing w:w="15" w:type="dxa"/>
+        <w:tblCellMar>
+          <w:left w:w="0" w:type="dxa"/>
+          <w:right w:w="0" w:type="dxa"/>
+        </w:tblCellMar>
         <w:tblLook w:val="04A0" w:firstRow="1" w:lastRow="0" w:firstColumn="1" w:lastColumn="0" w:noHBand="0" w:noVBand="1"/>
       </w:tblPr>
       <w:tblGrid>
-        <w:gridCol w:w="1011"/>
-        <w:gridCol w:w="1833"/>
-        <w:gridCol w:w="1748"/>
-        <w:gridCol w:w="3217"/>
-        <w:gridCol w:w="1113"/>
-        <w:gridCol w:w="1806"/>
-        <w:gridCol w:w="2085"/>
+        <w:gridCol w:w="1315"/>
+        <w:gridCol w:w="1986"/>
+        <w:gridCol w:w="2155"/>
+        <w:gridCol w:w="1384"/>
+        <w:gridCol w:w="1410"/>
+        <w:gridCol w:w="1196"/>
+        <w:gridCol w:w="2614"/>
+        <w:gridCol w:w="2630"/>
       </w:tblGrid>
       <w:tr>
-        <w:tc>
-          <w:tcPr>
-            <w:tcW w:w="1011" w:type="dxa"/>
-            <w:vAlign w:val="center"/>
-          </w:tcPr>
-          <w:p>
-            <w:pPr>
+        <w:trPr>
+          <w:tblHeader/>
+          <w:tblCellSpacing w:w="15" w:type="dxa"/>
+        </w:trPr>
+        <w:tc>
+          <w:tcPr>
+            <w:tcW w:w="0" w:type="auto"/>
+            <w:tcBorders>
+              <w:top w:val="single" w:sz="6" w:space="0" w:color="auto"/>
+              <w:left w:val="single" w:sz="6" w:space="0" w:color="auto"/>
+              <w:bottom w:val="single" w:sz="6" w:space="0" w:color="auto"/>
+              <w:right w:val="single" w:sz="6" w:space="0" w:color="auto"/>
+            </w:tcBorders>
+            <w:tcMar>
+              <w:top w:w="120" w:type="dxa"/>
+              <w:left w:w="180" w:type="dxa"/>
+              <w:bottom w:w="120" w:type="dxa"/>
+              <w:right w:w="180" w:type="dxa"/>
+            </w:tcMar>
+            <w:vAlign w:val="center"/>
+            <w:hideMark/>
+          </w:tcPr>
+          <w:p>
+            <w:pPr>
+              <w:rPr>
+                <w:lang w:val="es-ES"/>
+              </w:rPr>
+            </w:pPr>
+            <w:r>
               <w:rPr>
                 <w:b/>
                 <w:bCs/>
                 <w:lang w:val="es-ES"/>
               </w:rPr>
-            </w:pPr>
-            <w:r>
-              <w:rPr>
-                <w:rStyle w:val="Textoennegrita"/>
-                <w:rFonts w:cs="Arial"/>
-                <w:color w:val="1F1F1F"/>
-                <w:bdr w:val="none" w:sz="0" w:space="0" w:color="auto" w:frame="1"/>
-              </w:rPr>
-              <w:t>Id-TC</w:t>
-            </w:r>
-          </w:p>
-        </w:tc>
-        <w:tc>
-          <w:tcPr>
-            <w:tcW w:w="1833" w:type="dxa"/>
-            <w:vAlign w:val="center"/>
-          </w:tcPr>
-          <w:p>
-            <w:pPr>
+              <w:t>ID</w:t>
+            </w:r>
+          </w:p>
+        </w:tc>
+        <w:tc>
+          <w:tcPr>
+            <w:tcW w:w="0" w:type="auto"/>
+            <w:tcBorders>
+              <w:top w:val="single" w:sz="6" w:space="0" w:color="auto"/>
+              <w:left w:val="single" w:sz="6" w:space="0" w:color="auto"/>
+              <w:bottom w:val="single" w:sz="6" w:space="0" w:color="auto"/>
+              <w:right w:val="single" w:sz="6" w:space="0" w:color="auto"/>
+            </w:tcBorders>
+            <w:tcMar>
+              <w:top w:w="120" w:type="dxa"/>
+              <w:left w:w="180" w:type="dxa"/>
+              <w:bottom w:w="120" w:type="dxa"/>
+              <w:right w:w="180" w:type="dxa"/>
+            </w:tcMar>
+            <w:vAlign w:val="center"/>
+            <w:hideMark/>
+          </w:tcPr>
+          <w:p>
+            <w:pPr>
+              <w:rPr>
+                <w:lang w:val="es-ES"/>
+              </w:rPr>
+            </w:pPr>
+            <w:r>
               <w:rPr>
                 <w:b/>
                 <w:bCs/>
                 <w:lang w:val="es-ES"/>
               </w:rPr>
-            </w:pPr>
-            <w:proofErr w:type="spellStart"/>
-            <w:r>
-              <w:rPr>
-                <w:rStyle w:val="Textoennegrita"/>
-                <w:rFonts w:cs="Arial"/>
-                <w:color w:val="1F1F1F"/>
-                <w:bdr w:val="none" w:sz="0" w:space="0" w:color="auto" w:frame="1"/>
-              </w:rPr>
               <w:t>Escenario</w:t>
             </w:r>
-            <w:proofErr w:type="spellEnd"/>
-          </w:p>
-        </w:tc>
-        <w:tc>
-          <w:tcPr>
-            <w:tcW w:w="1748" w:type="dxa"/>
-            <w:vAlign w:val="center"/>
-          </w:tcPr>
-          <w:p>
-            <w:pPr>
+          </w:p>
+        </w:tc>
+        <w:tc>
+          <w:tcPr>
+            <w:tcW w:w="0" w:type="auto"/>
+            <w:tcBorders>
+              <w:top w:val="single" w:sz="6" w:space="0" w:color="auto"/>
+              <w:left w:val="single" w:sz="6" w:space="0" w:color="auto"/>
+              <w:bottom w:val="single" w:sz="6" w:space="0" w:color="auto"/>
+              <w:right w:val="single" w:sz="6" w:space="0" w:color="auto"/>
+            </w:tcBorders>
+            <w:tcMar>
+              <w:top w:w="120" w:type="dxa"/>
+              <w:left w:w="180" w:type="dxa"/>
+              <w:bottom w:w="120" w:type="dxa"/>
+              <w:right w:w="180" w:type="dxa"/>
+            </w:tcMar>
+            <w:vAlign w:val="center"/>
+            <w:hideMark/>
+          </w:tcPr>
+          <w:p>
+            <w:pPr>
+              <w:rPr>
+                <w:lang w:val="es-ES"/>
+              </w:rPr>
+            </w:pPr>
+            <w:r>
               <w:rPr>
                 <w:b/>
                 <w:bCs/>
                 <w:lang w:val="es-ES"/>
               </w:rPr>
-            </w:pPr>
-            <w:proofErr w:type="spellStart"/>
-            <w:r>
-              <w:rPr>
-                <w:rStyle w:val="Textoennegrita"/>
-                <w:rFonts w:cs="Arial"/>
-                <w:color w:val="1F1F1F"/>
-                <w:bdr w:val="none" w:sz="0" w:space="0" w:color="auto" w:frame="1"/>
-              </w:rPr>
-              <w:t>Flujo</w:t>
-            </w:r>
-            <w:proofErr w:type="spellEnd"/>
-          </w:p>
-        </w:tc>
-        <w:tc>
-          <w:tcPr>
-            <w:tcW w:w="3217" w:type="dxa"/>
-            <w:vAlign w:val="center"/>
-          </w:tcPr>
-          <w:p>
-            <w:pPr>
+              <w:t>Herramientas a la vista</w:t>
+            </w:r>
+          </w:p>
+        </w:tc>
+        <w:tc>
+          <w:tcPr>
+            <w:tcW w:w="0" w:type="auto"/>
+            <w:tcBorders>
+              <w:top w:val="single" w:sz="6" w:space="0" w:color="auto"/>
+              <w:left w:val="single" w:sz="6" w:space="0" w:color="auto"/>
+              <w:bottom w:val="single" w:sz="6" w:space="0" w:color="auto"/>
+              <w:right w:val="single" w:sz="6" w:space="0" w:color="auto"/>
+            </w:tcBorders>
+            <w:tcMar>
+              <w:top w:w="120" w:type="dxa"/>
+              <w:left w:w="180" w:type="dxa"/>
+              <w:bottom w:w="120" w:type="dxa"/>
+              <w:right w:w="180" w:type="dxa"/>
+            </w:tcMar>
+            <w:vAlign w:val="center"/>
+            <w:hideMark/>
+          </w:tcPr>
+          <w:p>
+            <w:pPr>
+              <w:rPr>
+                <w:lang w:val="es-ES"/>
+              </w:rPr>
+            </w:pPr>
+            <w:r>
               <w:rPr>
                 <w:b/>
                 <w:bCs/>
                 <w:lang w:val="es-ES"/>
               </w:rPr>
-            </w:pPr>
-            <w:proofErr w:type="spellStart"/>
-            <w:r>
-              <w:rPr>
-                <w:rStyle w:val="Textoennegrita"/>
-                <w:rFonts w:cs="Arial"/>
-                <w:color w:val="1F1F1F"/>
-                <w:bdr w:val="none" w:sz="0" w:space="0" w:color="auto" w:frame="1"/>
-              </w:rPr>
-              <w:t>Correspondencia</w:t>
-            </w:r>
-            <w:proofErr w:type="spellEnd"/>
-            <w:r>
-              <w:rPr>
-                <w:rStyle w:val="Textoennegrita"/>
-                <w:rFonts w:cs="Arial"/>
-                <w:color w:val="1F1F1F"/>
-                <w:bdr w:val="none" w:sz="0" w:space="0" w:color="auto" w:frame="1"/>
-              </w:rPr>
-              <w:t xml:space="preserve"> </w:t>
-            </w:r>
-            <w:proofErr w:type="spellStart"/>
-            <w:r>
-              <w:rPr>
-                <w:rStyle w:val="Textoennegrita"/>
-                <w:rFonts w:cs="Arial"/>
-                <w:color w:val="1F1F1F"/>
-                <w:bdr w:val="none" w:sz="0" w:space="0" w:color="auto" w:frame="1"/>
-              </w:rPr>
-              <w:t>en</w:t>
-            </w:r>
-            <w:proofErr w:type="spellEnd"/>
-            <w:r>
-              <w:rPr>
-                <w:rStyle w:val="Textoennegrita"/>
-                <w:rFonts w:cs="Arial"/>
-                <w:color w:val="1F1F1F"/>
-                <w:bdr w:val="none" w:sz="0" w:space="0" w:color="auto" w:frame="1"/>
-              </w:rPr>
-              <w:t xml:space="preserve"> </w:t>
-            </w:r>
-            <w:proofErr w:type="spellStart"/>
-            <w:r>
-              <w:rPr>
-                <w:rStyle w:val="Textoennegrita"/>
-                <w:rFonts w:cs="Arial"/>
-                <w:color w:val="1F1F1F"/>
-                <w:bdr w:val="none" w:sz="0" w:space="0" w:color="auto" w:frame="1"/>
-              </w:rPr>
-              <w:t>tu</w:t>
-            </w:r>
-            <w:proofErr w:type="spellEnd"/>
-            <w:r>
-              <w:rPr>
-                <w:rStyle w:val="Textoennegrita"/>
-                <w:rFonts w:cs="Arial"/>
-                <w:color w:val="1F1F1F"/>
-                <w:bdr w:val="none" w:sz="0" w:space="0" w:color="auto" w:frame="1"/>
-              </w:rPr>
-              <w:t xml:space="preserve"> Código</w:t>
-            </w:r>
-          </w:p>
-        </w:tc>
-        <w:tc>
-          <w:tcPr>
-            <w:tcW w:w="1113" w:type="dxa"/>
-            <w:vAlign w:val="center"/>
-          </w:tcPr>
-          <w:p>
-            <w:pPr>
+              <w:t>Filtro Nombre</w:t>
+            </w:r>
+          </w:p>
+        </w:tc>
+        <w:tc>
+          <w:tcPr>
+            <w:tcW w:w="0" w:type="auto"/>
+            <w:tcBorders>
+              <w:top w:val="single" w:sz="6" w:space="0" w:color="auto"/>
+              <w:left w:val="single" w:sz="6" w:space="0" w:color="auto"/>
+              <w:bottom w:val="single" w:sz="6" w:space="0" w:color="auto"/>
+              <w:right w:val="single" w:sz="6" w:space="0" w:color="auto"/>
+            </w:tcBorders>
+            <w:tcMar>
+              <w:top w:w="120" w:type="dxa"/>
+              <w:left w:w="180" w:type="dxa"/>
+              <w:bottom w:w="120" w:type="dxa"/>
+              <w:right w:w="180" w:type="dxa"/>
+            </w:tcMar>
+            <w:vAlign w:val="center"/>
+            <w:hideMark/>
+          </w:tcPr>
+          <w:p>
+            <w:pPr>
+              <w:rPr>
+                <w:lang w:val="es-ES"/>
+              </w:rPr>
+            </w:pPr>
+            <w:r>
               <w:rPr>
                 <w:b/>
                 <w:bCs/>
                 <w:lang w:val="es-ES"/>
               </w:rPr>
-            </w:pPr>
-            <w:r>
-              <w:rPr>
-                <w:rStyle w:val="Textoennegrita"/>
-                <w:rFonts w:cs="Arial"/>
-                <w:color w:val="1F1F1F"/>
-                <w:bdr w:val="none" w:sz="0" w:space="0" w:color="auto" w:frame="1"/>
-              </w:rPr>
-              <w:t>Id-TC</w:t>
-            </w:r>
-          </w:p>
-        </w:tc>
-        <w:tc>
-          <w:tcPr>
-            <w:tcW w:w="1806" w:type="dxa"/>
-            <w:vAlign w:val="center"/>
-          </w:tcPr>
-          <w:p>
-            <w:pPr>
+              <w:t>Filtro Material</w:t>
+            </w:r>
+          </w:p>
+        </w:tc>
+        <w:tc>
+          <w:tcPr>
+            <w:tcW w:w="0" w:type="auto"/>
+            <w:tcBorders>
+              <w:top w:val="single" w:sz="6" w:space="0" w:color="auto"/>
+              <w:left w:val="single" w:sz="6" w:space="0" w:color="auto"/>
+              <w:bottom w:val="single" w:sz="6" w:space="0" w:color="auto"/>
+              <w:right w:val="single" w:sz="6" w:space="0" w:color="auto"/>
+            </w:tcBorders>
+            <w:tcMar>
+              <w:top w:w="120" w:type="dxa"/>
+              <w:left w:w="180" w:type="dxa"/>
+              <w:bottom w:w="120" w:type="dxa"/>
+              <w:right w:w="180" w:type="dxa"/>
+            </w:tcMar>
+            <w:vAlign w:val="center"/>
+            <w:hideMark/>
+          </w:tcPr>
+          <w:p>
+            <w:pPr>
+              <w:rPr>
+                <w:lang w:val="es-ES"/>
+              </w:rPr>
+            </w:pPr>
+            <w:r>
               <w:rPr>
                 <w:b/>
                 <w:bCs/>
                 <w:lang w:val="es-ES"/>
               </w:rPr>
-            </w:pPr>
-            <w:proofErr w:type="spellStart"/>
-            <w:r>
-              <w:rPr>
-                <w:rStyle w:val="Textoennegrita"/>
-                <w:rFonts w:cs="Arial"/>
-                <w:color w:val="1F1F1F"/>
-                <w:bdr w:val="none" w:sz="0" w:space="0" w:color="auto" w:frame="1"/>
-              </w:rPr>
-              <w:t>Escenario</w:t>
-            </w:r>
-            <w:proofErr w:type="spellEnd"/>
-          </w:p>
-        </w:tc>
-        <w:tc>
-          <w:tcPr>
-            <w:tcW w:w="2085" w:type="dxa"/>
-            <w:vAlign w:val="center"/>
-          </w:tcPr>
-          <w:p>
-            <w:pPr>
+              <w:t>Filtro Precio</w:t>
+            </w:r>
+          </w:p>
+        </w:tc>
+        <w:tc>
+          <w:tcPr>
+            <w:tcW w:w="0" w:type="auto"/>
+            <w:tcBorders>
+              <w:top w:val="single" w:sz="6" w:space="0" w:color="auto"/>
+              <w:left w:val="single" w:sz="6" w:space="0" w:color="auto"/>
+              <w:bottom w:val="single" w:sz="6" w:space="0" w:color="auto"/>
+              <w:right w:val="single" w:sz="6" w:space="0" w:color="auto"/>
+            </w:tcBorders>
+            <w:tcMar>
+              <w:top w:w="120" w:type="dxa"/>
+              <w:left w:w="180" w:type="dxa"/>
+              <w:bottom w:w="120" w:type="dxa"/>
+              <w:right w:w="180" w:type="dxa"/>
+            </w:tcMar>
+            <w:vAlign w:val="center"/>
+            <w:hideMark/>
+          </w:tcPr>
+          <w:p>
+            <w:pPr>
+              <w:rPr>
+                <w:lang w:val="es-ES"/>
+              </w:rPr>
+            </w:pPr>
+            <w:r>
               <w:rPr>
                 <w:b/>
                 <w:bCs/>
                 <w:lang w:val="es-ES"/>
               </w:rPr>
-            </w:pPr>
-            <w:proofErr w:type="spellStart"/>
-            <w:r>
-              <w:rPr>
-                <w:rStyle w:val="Textoennegrita"/>
-                <w:rFonts w:cs="Arial"/>
-                <w:color w:val="1F1F1F"/>
-                <w:bdr w:val="none" w:sz="0" w:space="0" w:color="auto" w:frame="1"/>
-              </w:rPr>
-              <w:t>Flujo</w:t>
-            </w:r>
-            <w:proofErr w:type="spellEnd"/>
+              <w:t>Nombre, Apellido, Dirección, Pago, Cantidad, Descripción</w:t>
+            </w:r>
+          </w:p>
+        </w:tc>
+        <w:tc>
+          <w:tcPr>
+            <w:tcW w:w="0" w:type="auto"/>
+            <w:tcBorders>
+              <w:top w:val="single" w:sz="6" w:space="0" w:color="auto"/>
+              <w:left w:val="single" w:sz="6" w:space="0" w:color="auto"/>
+              <w:bottom w:val="single" w:sz="6" w:space="0" w:color="auto"/>
+              <w:right w:val="single" w:sz="6" w:space="0" w:color="auto"/>
+            </w:tcBorders>
+            <w:tcMar>
+              <w:top w:w="120" w:type="dxa"/>
+              <w:left w:w="180" w:type="dxa"/>
+              <w:bottom w:w="120" w:type="dxa"/>
+              <w:right w:w="180" w:type="dxa"/>
+            </w:tcMar>
+            <w:vAlign w:val="center"/>
+            <w:hideMark/>
+          </w:tcPr>
+          <w:p>
+            <w:pPr>
+              <w:rPr>
+                <w:lang w:val="es-ES"/>
+              </w:rPr>
+            </w:pPr>
+            <w:r>
+              <w:rPr>
+                <w:b/>
+                <w:bCs/>
+                <w:lang w:val="es-ES"/>
+              </w:rPr>
+              <w:t>Resultado esperado</w:t>
+            </w:r>
           </w:p>
         </w:tc>
       </w:tr>
       <w:tr>
-        <w:tc>
-          <w:tcPr>
-            <w:tcW w:w="1011" w:type="dxa"/>
-            <w:vAlign w:val="center"/>
-          </w:tcPr>
-          <w:p>
-            <w:pPr>
-              <w:rPr>
-                <w:lang w:val="es-ES"/>
-              </w:rPr>
-            </w:pPr>
-            <w:r>
-              <w:rPr>
-                <w:rFonts w:ascii="Arial" w:hAnsi="Arial" w:cs="Arial"/>
+        <w:trPr>
+          <w:tblCellSpacing w:w="15" w:type="dxa"/>
+        </w:trPr>
+        <w:tc>
+          <w:tcPr>
+            <w:tcW w:w="0" w:type="auto"/>
+            <w:tcBorders>
+              <w:top w:val="single" w:sz="6" w:space="0" w:color="auto"/>
+              <w:left w:val="single" w:sz="6" w:space="0" w:color="auto"/>
+              <w:bottom w:val="single" w:sz="6" w:space="0" w:color="auto"/>
+              <w:right w:val="single" w:sz="6" w:space="0" w:color="auto"/>
+            </w:tcBorders>
+            <w:tcMar>
+              <w:top w:w="120" w:type="dxa"/>
+              <w:left w:w="180" w:type="dxa"/>
+              <w:bottom w:w="120" w:type="dxa"/>
+              <w:right w:w="180" w:type="dxa"/>
+            </w:tcMar>
+            <w:vAlign w:val="center"/>
+            <w:hideMark/>
+          </w:tcPr>
+          <w:p>
+            <w:pPr>
+              <w:rPr>
+                <w:lang w:val="es-ES"/>
+              </w:rPr>
+            </w:pPr>
+            <w:r>
+              <w:rPr>
                 <w:b/>
                 <w:bCs/>
-                <w:color w:val="1F1F1F"/>
-                <w:bdr w:val="none" w:sz="0" w:space="0" w:color="auto" w:frame="1"/>
-              </w:rPr>
-              <w:t>Esc-1</w:t>
-            </w:r>
-          </w:p>
-        </w:tc>
-        <w:tc>
-          <w:tcPr>
-            <w:tcW w:w="1833" w:type="dxa"/>
-            <w:vAlign w:val="center"/>
-          </w:tcPr>
-          <w:p>
-            <w:pPr>
-              <w:pStyle w:val="NormalWeb"/>
-              <w:spacing w:before="0" w:beforeAutospacing="0" w:after="0" w:afterAutospacing="0"/>
-              <w:rPr>
-                <w:rFonts w:ascii="Arial" w:hAnsi="Arial" w:cs="Arial"/>
-                <w:color w:val="1F1F1F"/>
-              </w:rPr>
-            </w:pPr>
-            <w:r>
-              <w:rPr>
-                <w:rFonts w:ascii="Arial" w:hAnsi="Arial" w:cs="Arial"/>
+                <w:lang w:val="es-ES"/>
+              </w:rPr>
+              <w:t>CU_C_1</w:t>
+            </w:r>
+          </w:p>
+        </w:tc>
+        <w:tc>
+          <w:tcPr>
+            <w:tcW w:w="0" w:type="auto"/>
+            <w:tcBorders>
+              <w:top w:val="single" w:sz="6" w:space="0" w:color="auto"/>
+              <w:left w:val="single" w:sz="6" w:space="0" w:color="auto"/>
+              <w:bottom w:val="single" w:sz="6" w:space="0" w:color="auto"/>
+              <w:right w:val="single" w:sz="6" w:space="0" w:color="auto"/>
+            </w:tcBorders>
+            <w:tcMar>
+              <w:top w:w="120" w:type="dxa"/>
+              <w:left w:w="180" w:type="dxa"/>
+              <w:bottom w:w="120" w:type="dxa"/>
+              <w:right w:w="180" w:type="dxa"/>
+            </w:tcMar>
+            <w:vAlign w:val="center"/>
+            <w:hideMark/>
+          </w:tcPr>
+          <w:p>
+            <w:pPr>
+              <w:rPr>
+                <w:lang w:val="es-ES"/>
+              </w:rPr>
+            </w:pPr>
+            <w:r>
+              <w:rPr>
                 <w:b/>
                 <w:bCs/>
-                <w:color w:val="1F1F1F"/>
-                <w:bdr w:val="none" w:sz="0" w:space="0" w:color="auto" w:frame="1"/>
-              </w:rPr>
-              <w:t>Compra realizada con éxito</w:t>
-            </w:r>
-          </w:p>
-          <w:p>
-            <w:pPr>
-              <w:rPr>
-                <w:rFonts w:ascii="Arial" w:hAnsi="Arial" w:cs="Arial"/>
-                <w:color w:val="1F1F1F"/>
-              </w:rPr>
-            </w:pPr>
-            <w:r>
-              <w:rPr>
-                <w:rFonts w:ascii="Arial" w:hAnsi="Arial" w:cs="Arial"/>
-                <w:color w:val="1F1F1F"/>
+                <w:lang w:val="es-ES"/>
+              </w:rPr>
+              <w:t>Esc-1/Compra Exitosa</w:t>
+            </w:r>
+          </w:p>
+        </w:tc>
+        <w:tc>
+          <w:tcPr>
+            <w:tcW w:w="0" w:type="auto"/>
+            <w:tcBorders>
+              <w:top w:val="single" w:sz="6" w:space="0" w:color="auto"/>
+              <w:left w:val="single" w:sz="6" w:space="0" w:color="auto"/>
+              <w:bottom w:val="single" w:sz="6" w:space="0" w:color="auto"/>
+              <w:right w:val="single" w:sz="6" w:space="0" w:color="auto"/>
+            </w:tcBorders>
+            <w:tcMar>
+              <w:top w:w="120" w:type="dxa"/>
+              <w:left w:w="180" w:type="dxa"/>
+              <w:bottom w:w="120" w:type="dxa"/>
+              <w:right w:w="180" w:type="dxa"/>
+            </w:tcMar>
+            <w:vAlign w:val="center"/>
+            <w:hideMark/>
+          </w:tcPr>
+          <w:p>
+            <w:pPr>
+              <w:rPr>
+                <w:lang w:val="es-ES"/>
+              </w:rPr>
+            </w:pPr>
+            <w:r>
+              <w:rPr>
+                <w:lang w:val="es-ES"/>
+              </w:rPr>
+              <w:t>Lista de herramientas disponibles</w:t>
+            </w:r>
+          </w:p>
+        </w:tc>
+        <w:tc>
+          <w:tcPr>
+            <w:tcW w:w="0" w:type="auto"/>
+            <w:tcBorders>
+              <w:top w:val="single" w:sz="6" w:space="0" w:color="auto"/>
+              <w:left w:val="single" w:sz="6" w:space="0" w:color="auto"/>
+              <w:bottom w:val="single" w:sz="6" w:space="0" w:color="auto"/>
+              <w:right w:val="single" w:sz="6" w:space="0" w:color="auto"/>
+            </w:tcBorders>
+            <w:tcMar>
+              <w:top w:w="120" w:type="dxa"/>
+              <w:left w:w="180" w:type="dxa"/>
+              <w:bottom w:w="120" w:type="dxa"/>
+              <w:right w:w="180" w:type="dxa"/>
+            </w:tcMar>
+            <w:vAlign w:val="center"/>
+            <w:hideMark/>
+          </w:tcPr>
+          <w:p>
+            <w:pPr>
+              <w:rPr>
+                <w:lang w:val="es-ES"/>
+              </w:rPr>
+            </w:pPr>
+          </w:p>
+        </w:tc>
+        <w:tc>
+          <w:tcPr>
+            <w:tcW w:w="0" w:type="auto"/>
+            <w:tcBorders>
+              <w:top w:val="single" w:sz="6" w:space="0" w:color="auto"/>
+              <w:left w:val="single" w:sz="6" w:space="0" w:color="auto"/>
+              <w:bottom w:val="single" w:sz="6" w:space="0" w:color="auto"/>
+              <w:right w:val="single" w:sz="6" w:space="0" w:color="auto"/>
+            </w:tcBorders>
+            <w:tcMar>
+              <w:top w:w="120" w:type="dxa"/>
+              <w:left w:w="180" w:type="dxa"/>
+              <w:bottom w:w="120" w:type="dxa"/>
+              <w:right w:w="180" w:type="dxa"/>
+            </w:tcMar>
+            <w:vAlign w:val="center"/>
+            <w:hideMark/>
+          </w:tcPr>
+          <w:p>
+            <w:pPr>
+              <w:rPr>
+                <w:lang w:val="es-ES"/>
+              </w:rPr>
+            </w:pPr>
+          </w:p>
+        </w:tc>
+        <w:tc>
+          <w:tcPr>
+            <w:tcW w:w="0" w:type="auto"/>
+            <w:tcBorders>
+              <w:top w:val="single" w:sz="6" w:space="0" w:color="auto"/>
+              <w:left w:val="single" w:sz="6" w:space="0" w:color="auto"/>
+              <w:bottom w:val="single" w:sz="6" w:space="0" w:color="auto"/>
+              <w:right w:val="single" w:sz="6" w:space="0" w:color="auto"/>
+            </w:tcBorders>
+            <w:tcMar>
+              <w:top w:w="120" w:type="dxa"/>
+              <w:left w:w="180" w:type="dxa"/>
+              <w:bottom w:w="120" w:type="dxa"/>
+              <w:right w:w="180" w:type="dxa"/>
+            </w:tcMar>
+            <w:vAlign w:val="center"/>
+            <w:hideMark/>
+          </w:tcPr>
+          <w:p>
+            <w:pPr>
+              <w:rPr>
+                <w:lang w:val="es-ES"/>
+              </w:rPr>
+            </w:pPr>
+          </w:p>
+        </w:tc>
+        <w:tc>
+          <w:tcPr>
+            <w:tcW w:w="0" w:type="auto"/>
+            <w:tcBorders>
+              <w:top w:val="single" w:sz="6" w:space="0" w:color="auto"/>
+              <w:left w:val="single" w:sz="6" w:space="0" w:color="auto"/>
+              <w:bottom w:val="single" w:sz="6" w:space="0" w:color="auto"/>
+              <w:right w:val="single" w:sz="6" w:space="0" w:color="auto"/>
+            </w:tcBorders>
+            <w:tcMar>
+              <w:top w:w="120" w:type="dxa"/>
+              <w:left w:w="180" w:type="dxa"/>
+              <w:bottom w:w="120" w:type="dxa"/>
+              <w:right w:w="180" w:type="dxa"/>
+            </w:tcMar>
+            <w:vAlign w:val="center"/>
+            <w:hideMark/>
+          </w:tcPr>
+          <w:p>
+            <w:pPr>
+              <w:rPr>
+                <w:lang w:val="es-ES"/>
+              </w:rPr>
+            </w:pPr>
+            <w:proofErr w:type="spellStart"/>
+            <w:r>
+              <w:rPr>
+                <w:lang w:val="es-ES"/>
+              </w:rPr>
+              <w:t>Homer</w:t>
+            </w:r>
+            <w:proofErr w:type="spellEnd"/>
+            <w:r>
+              <w:rPr>
+                <w:lang w:val="es-ES"/>
+              </w:rPr>
+              <w:t xml:space="preserve">, Simpson, Calle Falsa 123, </w:t>
+            </w:r>
+            <w:proofErr w:type="spellStart"/>
+            <w:r>
+              <w:rPr>
+                <w:lang w:val="es-ES"/>
+              </w:rPr>
+              <w:t>TarjetaCredito</w:t>
+            </w:r>
+            <w:proofErr w:type="spellEnd"/>
+            <w:r>
+              <w:rPr>
+                <w:lang w:val="es-ES"/>
+              </w:rPr>
+              <w:t>, 2, "Para arreglar la mesa"</w:t>
+            </w:r>
+          </w:p>
+        </w:tc>
+        <w:tc>
+          <w:tcPr>
+            <w:tcW w:w="0" w:type="auto"/>
+            <w:tcBorders>
+              <w:top w:val="single" w:sz="6" w:space="0" w:color="auto"/>
+              <w:left w:val="single" w:sz="6" w:space="0" w:color="auto"/>
+              <w:bottom w:val="single" w:sz="6" w:space="0" w:color="auto"/>
+              <w:right w:val="single" w:sz="6" w:space="0" w:color="auto"/>
+            </w:tcBorders>
+            <w:tcMar>
+              <w:top w:w="120" w:type="dxa"/>
+              <w:left w:w="180" w:type="dxa"/>
+              <w:bottom w:w="120" w:type="dxa"/>
+              <w:right w:w="180" w:type="dxa"/>
+            </w:tcMar>
+            <w:vAlign w:val="center"/>
+            <w:hideMark/>
+          </w:tcPr>
+          <w:p>
+            <w:pPr>
+              <w:rPr>
+                <w:lang w:val="es-ES"/>
+              </w:rPr>
+            </w:pPr>
+            <w:r>
+              <w:rPr>
+                <w:lang w:val="es-ES"/>
+              </w:rPr>
+              <w:t>“Detalle Compra – AppForSEII2526”</w:t>
+            </w:r>
+          </w:p>
+          <w:p>
+            <w:pPr>
+              <w:rPr>
+                <w:lang w:val="es-ES"/>
+              </w:rPr>
+            </w:pPr>
+            <w:r>
+              <w:rPr>
+                <w:lang w:val="es-ES"/>
               </w:rPr>
               <w:br/>
             </w:r>
@@ -2157,550 +2836,1548 @@
                 <w:lang w:val="es-ES"/>
               </w:rPr>
             </w:pPr>
-            <w:r>
-              <w:rPr>
-                <w:rFonts w:ascii="Arial" w:hAnsi="Arial" w:cs="Arial"/>
-                <w:color w:val="1F1F1F"/>
-              </w:rPr>
-              <w:t>(</w:t>
-            </w:r>
             <w:proofErr w:type="spellStart"/>
             <w:r>
               <w:rPr>
-                <w:rFonts w:ascii="Arial" w:hAnsi="Arial" w:cs="Arial"/>
-                <w:color w:val="1F1F1F"/>
-              </w:rPr>
-              <w:t>Selección</w:t>
+                <w:lang w:val="es-ES"/>
+              </w:rPr>
+              <w:t>Homer</w:t>
             </w:r>
             <w:proofErr w:type="spellEnd"/>
             <w:r>
               <w:rPr>
-                <w:rFonts w:ascii="Arial" w:hAnsi="Arial" w:cs="Arial"/>
-                <w:color w:val="1F1F1F"/>
-              </w:rPr>
-              <w:t xml:space="preserve">, </w:t>
-            </w:r>
-            <w:proofErr w:type="spellStart"/>
-            <w:r>
-              <w:rPr>
-                <w:rFonts w:ascii="Arial" w:hAnsi="Arial" w:cs="Arial"/>
-                <w:color w:val="1F1F1F"/>
-              </w:rPr>
-              <w:t>formulario</w:t>
-            </w:r>
-            <w:proofErr w:type="spellEnd"/>
-            <w:r>
-              <w:rPr>
-                <w:rFonts w:ascii="Arial" w:hAnsi="Arial" w:cs="Arial"/>
-                <w:color w:val="1F1F1F"/>
-              </w:rPr>
-              <w:t xml:space="preserve"> y </w:t>
-            </w:r>
-            <w:proofErr w:type="spellStart"/>
-            <w:r>
-              <w:rPr>
-                <w:rFonts w:ascii="Arial" w:hAnsi="Arial" w:cs="Arial"/>
-                <w:color w:val="1F1F1F"/>
-              </w:rPr>
-              <w:t>confirmación</w:t>
-            </w:r>
-            <w:proofErr w:type="spellEnd"/>
-            <w:r>
-              <w:rPr>
-                <w:rFonts w:ascii="Arial" w:hAnsi="Arial" w:cs="Arial"/>
-                <w:color w:val="1F1F1F"/>
-              </w:rPr>
-              <w:t>)</w:t>
-            </w:r>
-          </w:p>
-        </w:tc>
-        <w:tc>
-          <w:tcPr>
-            <w:tcW w:w="1748" w:type="dxa"/>
-            <w:vAlign w:val="center"/>
-          </w:tcPr>
-          <w:p>
-            <w:pPr>
-              <w:rPr>
-                <w:lang w:val="es-ES"/>
-              </w:rPr>
-            </w:pPr>
-            <w:r>
-              <w:rPr>
-                <w:rFonts w:ascii="Arial" w:hAnsi="Arial" w:cs="Arial"/>
+                <w:lang w:val="es-ES"/>
+              </w:rPr>
+              <w:t xml:space="preserve"> Simpson, 60€, 2 unidades, "Para arreglar la mesa"</w:t>
+            </w:r>
+          </w:p>
+        </w:tc>
+      </w:tr>
+      <w:tr>
+        <w:trPr>
+          <w:tblCellSpacing w:w="15" w:type="dxa"/>
+        </w:trPr>
+        <w:tc>
+          <w:tcPr>
+            <w:tcW w:w="0" w:type="auto"/>
+            <w:tcBorders>
+              <w:top w:val="single" w:sz="6" w:space="0" w:color="auto"/>
+              <w:left w:val="single" w:sz="6" w:space="0" w:color="auto"/>
+              <w:bottom w:val="single" w:sz="6" w:space="0" w:color="auto"/>
+              <w:right w:val="single" w:sz="6" w:space="0" w:color="auto"/>
+            </w:tcBorders>
+            <w:tcMar>
+              <w:top w:w="120" w:type="dxa"/>
+              <w:left w:w="180" w:type="dxa"/>
+              <w:bottom w:w="120" w:type="dxa"/>
+              <w:right w:w="180" w:type="dxa"/>
+            </w:tcMar>
+            <w:vAlign w:val="center"/>
+            <w:hideMark/>
+          </w:tcPr>
+          <w:p>
+            <w:pPr>
+              <w:rPr>
+                <w:lang w:val="es-ES"/>
+              </w:rPr>
+            </w:pPr>
+            <w:r>
+              <w:rPr>
                 <w:b/>
                 <w:bCs/>
-                <w:color w:val="1F1F1F"/>
-                <w:bdr w:val="none" w:sz="0" w:space="0" w:color="auto" w:frame="1"/>
-              </w:rPr>
-              <w:t>FB</w:t>
-            </w:r>
-          </w:p>
-        </w:tc>
-        <w:tc>
-          <w:tcPr>
-            <w:tcW w:w="3217" w:type="dxa"/>
-            <w:vAlign w:val="center"/>
-          </w:tcPr>
-          <w:p>
-            <w:pPr>
-              <w:rPr>
-                <w:lang w:val="es-ES"/>
-              </w:rPr>
-            </w:pPr>
-            <w:r>
-              <w:rPr>
-                <w:rStyle w:val="CdigoHTML"/>
-                <w:rFonts w:cs="Arial"/>
-                <w:color w:val="444746"/>
-                <w:bdr w:val="none" w:sz="0" w:space="0" w:color="auto" w:frame="1"/>
-              </w:rPr>
-              <w:t>CU1_FB_ComprarHerramienta</w:t>
-            </w:r>
-          </w:p>
-        </w:tc>
-        <w:tc>
-          <w:tcPr>
-            <w:tcW w:w="1113" w:type="dxa"/>
-            <w:vAlign w:val="center"/>
-          </w:tcPr>
-          <w:p>
-            <w:pPr>
-              <w:rPr>
-                <w:lang w:val="es-ES"/>
-              </w:rPr>
-            </w:pPr>
-            <w:r>
-              <w:rPr>
-                <w:rFonts w:ascii="Arial" w:hAnsi="Arial" w:cs="Arial"/>
+                <w:lang w:val="es-ES"/>
+              </w:rPr>
+              <w:t>CU_C_2</w:t>
+            </w:r>
+          </w:p>
+        </w:tc>
+        <w:tc>
+          <w:tcPr>
+            <w:tcW w:w="0" w:type="auto"/>
+            <w:tcBorders>
+              <w:top w:val="single" w:sz="6" w:space="0" w:color="auto"/>
+              <w:left w:val="single" w:sz="6" w:space="0" w:color="auto"/>
+              <w:bottom w:val="single" w:sz="6" w:space="0" w:color="auto"/>
+              <w:right w:val="single" w:sz="6" w:space="0" w:color="auto"/>
+            </w:tcBorders>
+            <w:tcMar>
+              <w:top w:w="120" w:type="dxa"/>
+              <w:left w:w="180" w:type="dxa"/>
+              <w:bottom w:w="120" w:type="dxa"/>
+              <w:right w:w="180" w:type="dxa"/>
+            </w:tcMar>
+            <w:vAlign w:val="center"/>
+            <w:hideMark/>
+          </w:tcPr>
+          <w:p>
+            <w:pPr>
+              <w:rPr>
+                <w:lang w:val="es-ES"/>
+              </w:rPr>
+            </w:pPr>
+            <w:r>
+              <w:rPr>
                 <w:b/>
                 <w:bCs/>
-                <w:color w:val="1F1F1F"/>
-                <w:bdr w:val="none" w:sz="0" w:space="0" w:color="auto" w:frame="1"/>
-              </w:rPr>
-              <w:t>Esc-1</w:t>
-            </w:r>
-          </w:p>
-        </w:tc>
-        <w:tc>
-          <w:tcPr>
-            <w:tcW w:w="1806" w:type="dxa"/>
-            <w:vAlign w:val="center"/>
-          </w:tcPr>
-          <w:p>
-            <w:pPr>
-              <w:pStyle w:val="NormalWeb"/>
-              <w:spacing w:before="0" w:beforeAutospacing="0" w:after="0" w:afterAutospacing="0"/>
-              <w:rPr>
-                <w:rFonts w:ascii="Arial" w:hAnsi="Arial" w:cs="Arial"/>
-                <w:color w:val="1F1F1F"/>
-              </w:rPr>
-            </w:pPr>
-            <w:r>
-              <w:rPr>
-                <w:rFonts w:ascii="Arial" w:hAnsi="Arial" w:cs="Arial"/>
+                <w:lang w:val="es-ES"/>
+              </w:rPr>
+              <w:t>Esc-2/Filtro Nombre</w:t>
+            </w:r>
+          </w:p>
+        </w:tc>
+        <w:tc>
+          <w:tcPr>
+            <w:tcW w:w="0" w:type="auto"/>
+            <w:tcBorders>
+              <w:top w:val="single" w:sz="6" w:space="0" w:color="auto"/>
+              <w:left w:val="single" w:sz="6" w:space="0" w:color="auto"/>
+              <w:bottom w:val="single" w:sz="6" w:space="0" w:color="auto"/>
+              <w:right w:val="single" w:sz="6" w:space="0" w:color="auto"/>
+            </w:tcBorders>
+            <w:tcMar>
+              <w:top w:w="120" w:type="dxa"/>
+              <w:left w:w="180" w:type="dxa"/>
+              <w:bottom w:w="120" w:type="dxa"/>
+              <w:right w:w="180" w:type="dxa"/>
+            </w:tcMar>
+            <w:vAlign w:val="center"/>
+            <w:hideMark/>
+          </w:tcPr>
+          <w:p>
+            <w:pPr>
+              <w:rPr>
+                <w:lang w:val="es-ES"/>
+              </w:rPr>
+            </w:pPr>
+            <w:r>
+              <w:rPr>
+                <w:lang w:val="es-ES"/>
+              </w:rPr>
+              <w:t>Lista de herramientas disponibles</w:t>
+            </w:r>
+          </w:p>
+        </w:tc>
+        <w:tc>
+          <w:tcPr>
+            <w:tcW w:w="0" w:type="auto"/>
+            <w:tcBorders>
+              <w:top w:val="single" w:sz="6" w:space="0" w:color="auto"/>
+              <w:left w:val="single" w:sz="6" w:space="0" w:color="auto"/>
+              <w:bottom w:val="single" w:sz="6" w:space="0" w:color="auto"/>
+              <w:right w:val="single" w:sz="6" w:space="0" w:color="auto"/>
+            </w:tcBorders>
+            <w:tcMar>
+              <w:top w:w="120" w:type="dxa"/>
+              <w:left w:w="180" w:type="dxa"/>
+              <w:bottom w:w="120" w:type="dxa"/>
+              <w:right w:w="180" w:type="dxa"/>
+            </w:tcMar>
+            <w:vAlign w:val="center"/>
+            <w:hideMark/>
+          </w:tcPr>
+          <w:p>
+            <w:pPr>
+              <w:rPr>
+                <w:lang w:val="es-ES"/>
+              </w:rPr>
+            </w:pPr>
+            <w:r>
+              <w:rPr>
+                <w:lang w:val="es-ES"/>
+              </w:rPr>
+              <w:t>Martillo</w:t>
+            </w:r>
+          </w:p>
+        </w:tc>
+        <w:tc>
+          <w:tcPr>
+            <w:tcW w:w="0" w:type="auto"/>
+            <w:tcBorders>
+              <w:top w:val="single" w:sz="6" w:space="0" w:color="auto"/>
+              <w:left w:val="single" w:sz="6" w:space="0" w:color="auto"/>
+              <w:bottom w:val="single" w:sz="6" w:space="0" w:color="auto"/>
+              <w:right w:val="single" w:sz="6" w:space="0" w:color="auto"/>
+            </w:tcBorders>
+            <w:tcMar>
+              <w:top w:w="120" w:type="dxa"/>
+              <w:left w:w="180" w:type="dxa"/>
+              <w:bottom w:w="120" w:type="dxa"/>
+              <w:right w:w="180" w:type="dxa"/>
+            </w:tcMar>
+            <w:vAlign w:val="center"/>
+            <w:hideMark/>
+          </w:tcPr>
+          <w:p>
+            <w:pPr>
+              <w:rPr>
+                <w:lang w:val="es-ES"/>
+              </w:rPr>
+            </w:pPr>
+          </w:p>
+        </w:tc>
+        <w:tc>
+          <w:tcPr>
+            <w:tcW w:w="0" w:type="auto"/>
+            <w:tcBorders>
+              <w:top w:val="single" w:sz="6" w:space="0" w:color="auto"/>
+              <w:left w:val="single" w:sz="6" w:space="0" w:color="auto"/>
+              <w:bottom w:val="single" w:sz="6" w:space="0" w:color="auto"/>
+              <w:right w:val="single" w:sz="6" w:space="0" w:color="auto"/>
+            </w:tcBorders>
+            <w:tcMar>
+              <w:top w:w="120" w:type="dxa"/>
+              <w:left w:w="180" w:type="dxa"/>
+              <w:bottom w:w="120" w:type="dxa"/>
+              <w:right w:w="180" w:type="dxa"/>
+            </w:tcMar>
+            <w:vAlign w:val="center"/>
+            <w:hideMark/>
+          </w:tcPr>
+          <w:p>
+            <w:pPr>
+              <w:rPr>
+                <w:lang w:val="es-ES"/>
+              </w:rPr>
+            </w:pPr>
+          </w:p>
+        </w:tc>
+        <w:tc>
+          <w:tcPr>
+            <w:tcW w:w="0" w:type="auto"/>
+            <w:tcBorders>
+              <w:top w:val="single" w:sz="6" w:space="0" w:color="auto"/>
+              <w:left w:val="single" w:sz="6" w:space="0" w:color="auto"/>
+              <w:bottom w:val="single" w:sz="6" w:space="0" w:color="auto"/>
+              <w:right w:val="single" w:sz="6" w:space="0" w:color="auto"/>
+            </w:tcBorders>
+            <w:tcMar>
+              <w:top w:w="120" w:type="dxa"/>
+              <w:left w:w="180" w:type="dxa"/>
+              <w:bottom w:w="120" w:type="dxa"/>
+              <w:right w:w="180" w:type="dxa"/>
+            </w:tcMar>
+            <w:vAlign w:val="center"/>
+            <w:hideMark/>
+          </w:tcPr>
+          <w:p>
+            <w:pPr>
+              <w:rPr>
+                <w:lang w:val="es-ES"/>
+              </w:rPr>
+            </w:pPr>
+          </w:p>
+        </w:tc>
+        <w:tc>
+          <w:tcPr>
+            <w:tcW w:w="0" w:type="auto"/>
+            <w:tcBorders>
+              <w:top w:val="single" w:sz="6" w:space="0" w:color="auto"/>
+              <w:left w:val="single" w:sz="6" w:space="0" w:color="auto"/>
+              <w:bottom w:val="single" w:sz="6" w:space="0" w:color="auto"/>
+              <w:right w:val="single" w:sz="6" w:space="0" w:color="auto"/>
+            </w:tcBorders>
+            <w:tcMar>
+              <w:top w:w="120" w:type="dxa"/>
+              <w:left w:w="180" w:type="dxa"/>
+              <w:bottom w:w="120" w:type="dxa"/>
+              <w:right w:w="180" w:type="dxa"/>
+            </w:tcMar>
+            <w:vAlign w:val="center"/>
+            <w:hideMark/>
+          </w:tcPr>
+          <w:p>
+            <w:pPr>
+              <w:rPr>
+                <w:lang w:val="es-ES"/>
+              </w:rPr>
+            </w:pPr>
+            <w:r>
+              <w:rPr>
+                <w:lang w:val="es-ES"/>
+              </w:rPr>
+              <w:t>Herramientas filtradas:</w:t>
+            </w:r>
+          </w:p>
+          <w:p>
+            <w:pPr>
+              <w:rPr>
+                <w:lang w:val="es-ES"/>
+              </w:rPr>
+            </w:pPr>
+            <w:r>
+              <w:rPr>
+                <w:lang w:val="es-ES"/>
+              </w:rPr>
+              <w:br/>
+            </w:r>
+          </w:p>
+          <w:p>
+            <w:pPr>
+              <w:rPr>
+                <w:lang w:val="es-ES"/>
+              </w:rPr>
+            </w:pPr>
+            <w:r>
+              <w:rPr>
+                <w:lang w:val="es-ES"/>
+              </w:rPr>
+              <w:t>{Martillo, Jaime, Hierro, 30}</w:t>
+            </w:r>
+          </w:p>
+        </w:tc>
+      </w:tr>
+      <w:tr>
+        <w:trPr>
+          <w:trHeight w:val="3381"/>
+          <w:tblCellSpacing w:w="15" w:type="dxa"/>
+        </w:trPr>
+        <w:tc>
+          <w:tcPr>
+            <w:tcW w:w="0" w:type="auto"/>
+            <w:tcBorders>
+              <w:top w:val="single" w:sz="6" w:space="0" w:color="auto"/>
+              <w:left w:val="single" w:sz="6" w:space="0" w:color="auto"/>
+              <w:bottom w:val="single" w:sz="6" w:space="0" w:color="auto"/>
+              <w:right w:val="single" w:sz="6" w:space="0" w:color="auto"/>
+            </w:tcBorders>
+            <w:tcMar>
+              <w:top w:w="120" w:type="dxa"/>
+              <w:left w:w="180" w:type="dxa"/>
+              <w:bottom w:w="120" w:type="dxa"/>
+              <w:right w:w="180" w:type="dxa"/>
+            </w:tcMar>
+            <w:vAlign w:val="center"/>
+            <w:hideMark/>
+          </w:tcPr>
+          <w:p>
+            <w:pPr>
+              <w:rPr>
+                <w:lang w:val="es-ES"/>
+              </w:rPr>
+            </w:pPr>
+            <w:r>
+              <w:rPr>
                 <w:b/>
                 <w:bCs/>
-                <w:color w:val="1F1F1F"/>
-                <w:bdr w:val="none" w:sz="0" w:space="0" w:color="auto" w:frame="1"/>
-              </w:rPr>
-              <w:t>Compra realizada con éxito</w:t>
-            </w:r>
-          </w:p>
-          <w:p>
-            <w:pPr>
-              <w:rPr>
-                <w:rFonts w:ascii="Arial" w:hAnsi="Arial" w:cs="Arial"/>
-                <w:color w:val="1F1F1F"/>
-              </w:rPr>
-            </w:pPr>
-            <w:r>
-              <w:rPr>
-                <w:rFonts w:ascii="Arial" w:hAnsi="Arial" w:cs="Arial"/>
-                <w:color w:val="1F1F1F"/>
-              </w:rPr>
-              <w:br/>
-            </w:r>
-          </w:p>
-          <w:p>
-            <w:pPr>
-              <w:rPr>
-                <w:lang w:val="es-ES"/>
-              </w:rPr>
-            </w:pPr>
-            <w:r>
-              <w:rPr>
-                <w:rFonts w:ascii="Arial" w:hAnsi="Arial" w:cs="Arial"/>
-                <w:color w:val="1F1F1F"/>
-              </w:rPr>
-              <w:t>(</w:t>
-            </w:r>
-            <w:proofErr w:type="spellStart"/>
-            <w:r>
-              <w:rPr>
-                <w:rFonts w:ascii="Arial" w:hAnsi="Arial" w:cs="Arial"/>
-                <w:color w:val="1F1F1F"/>
-              </w:rPr>
-              <w:t>Selección</w:t>
-            </w:r>
-            <w:proofErr w:type="spellEnd"/>
-            <w:r>
-              <w:rPr>
-                <w:rFonts w:ascii="Arial" w:hAnsi="Arial" w:cs="Arial"/>
-                <w:color w:val="1F1F1F"/>
-              </w:rPr>
-              <w:t xml:space="preserve">, </w:t>
-            </w:r>
-            <w:proofErr w:type="spellStart"/>
-            <w:r>
-              <w:rPr>
-                <w:rFonts w:ascii="Arial" w:hAnsi="Arial" w:cs="Arial"/>
-                <w:color w:val="1F1F1F"/>
-              </w:rPr>
-              <w:t>formulario</w:t>
-            </w:r>
-            <w:proofErr w:type="spellEnd"/>
-            <w:r>
-              <w:rPr>
-                <w:rFonts w:ascii="Arial" w:hAnsi="Arial" w:cs="Arial"/>
-                <w:color w:val="1F1F1F"/>
-              </w:rPr>
-              <w:t xml:space="preserve"> y </w:t>
-            </w:r>
-            <w:proofErr w:type="spellStart"/>
-            <w:r>
-              <w:rPr>
-                <w:rFonts w:ascii="Arial" w:hAnsi="Arial" w:cs="Arial"/>
-                <w:color w:val="1F1F1F"/>
-              </w:rPr>
-              <w:t>confirmación</w:t>
-            </w:r>
-            <w:proofErr w:type="spellEnd"/>
-            <w:r>
-              <w:rPr>
-                <w:rFonts w:ascii="Arial" w:hAnsi="Arial" w:cs="Arial"/>
-                <w:color w:val="1F1F1F"/>
-              </w:rPr>
-              <w:t>)</w:t>
-            </w:r>
-          </w:p>
-        </w:tc>
-        <w:tc>
-          <w:tcPr>
-            <w:tcW w:w="2085" w:type="dxa"/>
-            <w:vAlign w:val="center"/>
-          </w:tcPr>
-          <w:p>
-            <w:pPr>
-              <w:rPr>
-                <w:lang w:val="es-ES"/>
-              </w:rPr>
-            </w:pPr>
-            <w:r>
-              <w:rPr>
-                <w:rFonts w:ascii="Arial" w:hAnsi="Arial" w:cs="Arial"/>
+                <w:lang w:val="es-ES"/>
+              </w:rPr>
+              <w:t>CU_C_3</w:t>
+            </w:r>
+          </w:p>
+        </w:tc>
+        <w:tc>
+          <w:tcPr>
+            <w:tcW w:w="0" w:type="auto"/>
+            <w:tcBorders>
+              <w:top w:val="single" w:sz="6" w:space="0" w:color="auto"/>
+              <w:left w:val="single" w:sz="6" w:space="0" w:color="auto"/>
+              <w:bottom w:val="single" w:sz="6" w:space="0" w:color="auto"/>
+              <w:right w:val="single" w:sz="6" w:space="0" w:color="auto"/>
+            </w:tcBorders>
+            <w:tcMar>
+              <w:top w:w="120" w:type="dxa"/>
+              <w:left w:w="180" w:type="dxa"/>
+              <w:bottom w:w="120" w:type="dxa"/>
+              <w:right w:w="180" w:type="dxa"/>
+            </w:tcMar>
+            <w:vAlign w:val="center"/>
+            <w:hideMark/>
+          </w:tcPr>
+          <w:p>
+            <w:pPr>
+              <w:rPr>
+                <w:lang w:val="es-ES"/>
+              </w:rPr>
+            </w:pPr>
+            <w:r>
+              <w:rPr>
                 <w:b/>
                 <w:bCs/>
-                <w:color w:val="1F1F1F"/>
-                <w:bdr w:val="none" w:sz="0" w:space="0" w:color="auto" w:frame="1"/>
-              </w:rPr>
-              <w:t>FB</w:t>
+                <w:lang w:val="es-ES"/>
+              </w:rPr>
+              <w:t>Esc-2/Filtro Material</w:t>
+            </w:r>
+          </w:p>
+        </w:tc>
+        <w:tc>
+          <w:tcPr>
+            <w:tcW w:w="0" w:type="auto"/>
+            <w:tcBorders>
+              <w:top w:val="single" w:sz="6" w:space="0" w:color="auto"/>
+              <w:left w:val="single" w:sz="6" w:space="0" w:color="auto"/>
+              <w:bottom w:val="single" w:sz="6" w:space="0" w:color="auto"/>
+              <w:right w:val="single" w:sz="6" w:space="0" w:color="auto"/>
+            </w:tcBorders>
+            <w:tcMar>
+              <w:top w:w="120" w:type="dxa"/>
+              <w:left w:w="180" w:type="dxa"/>
+              <w:bottom w:w="120" w:type="dxa"/>
+              <w:right w:w="180" w:type="dxa"/>
+            </w:tcMar>
+            <w:vAlign w:val="center"/>
+            <w:hideMark/>
+          </w:tcPr>
+          <w:p>
+            <w:pPr>
+              <w:rPr>
+                <w:lang w:val="es-ES"/>
+              </w:rPr>
+            </w:pPr>
+            <w:r>
+              <w:rPr>
+                <w:lang w:val="es-ES"/>
+              </w:rPr>
+              <w:t>Lista de herramientas disponibles</w:t>
+            </w:r>
+          </w:p>
+        </w:tc>
+        <w:tc>
+          <w:tcPr>
+            <w:tcW w:w="0" w:type="auto"/>
+            <w:tcBorders>
+              <w:top w:val="single" w:sz="6" w:space="0" w:color="auto"/>
+              <w:left w:val="single" w:sz="6" w:space="0" w:color="auto"/>
+              <w:bottom w:val="single" w:sz="6" w:space="0" w:color="auto"/>
+              <w:right w:val="single" w:sz="6" w:space="0" w:color="auto"/>
+            </w:tcBorders>
+            <w:tcMar>
+              <w:top w:w="120" w:type="dxa"/>
+              <w:left w:w="180" w:type="dxa"/>
+              <w:bottom w:w="120" w:type="dxa"/>
+              <w:right w:w="180" w:type="dxa"/>
+            </w:tcMar>
+            <w:vAlign w:val="center"/>
+            <w:hideMark/>
+          </w:tcPr>
+          <w:p>
+            <w:pPr>
+              <w:rPr>
+                <w:lang w:val="es-ES"/>
+              </w:rPr>
+            </w:pPr>
+          </w:p>
+        </w:tc>
+        <w:tc>
+          <w:tcPr>
+            <w:tcW w:w="0" w:type="auto"/>
+            <w:tcBorders>
+              <w:top w:val="single" w:sz="6" w:space="0" w:color="auto"/>
+              <w:left w:val="single" w:sz="6" w:space="0" w:color="auto"/>
+              <w:bottom w:val="single" w:sz="6" w:space="0" w:color="auto"/>
+              <w:right w:val="single" w:sz="6" w:space="0" w:color="auto"/>
+            </w:tcBorders>
+            <w:tcMar>
+              <w:top w:w="120" w:type="dxa"/>
+              <w:left w:w="180" w:type="dxa"/>
+              <w:bottom w:w="120" w:type="dxa"/>
+              <w:right w:w="180" w:type="dxa"/>
+            </w:tcMar>
+            <w:vAlign w:val="center"/>
+            <w:hideMark/>
+          </w:tcPr>
+          <w:p>
+            <w:pPr>
+              <w:rPr>
+                <w:lang w:val="es-ES"/>
+              </w:rPr>
+            </w:pPr>
+            <w:r>
+              <w:rPr>
+                <w:lang w:val="es-ES"/>
+              </w:rPr>
+              <w:t>Hierro</w:t>
+            </w:r>
+          </w:p>
+        </w:tc>
+        <w:tc>
+          <w:tcPr>
+            <w:tcW w:w="0" w:type="auto"/>
+            <w:tcBorders>
+              <w:top w:val="single" w:sz="6" w:space="0" w:color="auto"/>
+              <w:left w:val="single" w:sz="6" w:space="0" w:color="auto"/>
+              <w:bottom w:val="single" w:sz="6" w:space="0" w:color="auto"/>
+              <w:right w:val="single" w:sz="6" w:space="0" w:color="auto"/>
+            </w:tcBorders>
+            <w:tcMar>
+              <w:top w:w="120" w:type="dxa"/>
+              <w:left w:w="180" w:type="dxa"/>
+              <w:bottom w:w="120" w:type="dxa"/>
+              <w:right w:w="180" w:type="dxa"/>
+            </w:tcMar>
+            <w:vAlign w:val="center"/>
+            <w:hideMark/>
+          </w:tcPr>
+          <w:p>
+            <w:pPr>
+              <w:rPr>
+                <w:lang w:val="es-ES"/>
+              </w:rPr>
+            </w:pPr>
+          </w:p>
+        </w:tc>
+        <w:tc>
+          <w:tcPr>
+            <w:tcW w:w="0" w:type="auto"/>
+            <w:tcBorders>
+              <w:top w:val="single" w:sz="6" w:space="0" w:color="auto"/>
+              <w:left w:val="single" w:sz="6" w:space="0" w:color="auto"/>
+              <w:bottom w:val="single" w:sz="6" w:space="0" w:color="auto"/>
+              <w:right w:val="single" w:sz="6" w:space="0" w:color="auto"/>
+            </w:tcBorders>
+            <w:tcMar>
+              <w:top w:w="120" w:type="dxa"/>
+              <w:left w:w="180" w:type="dxa"/>
+              <w:bottom w:w="120" w:type="dxa"/>
+              <w:right w:w="180" w:type="dxa"/>
+            </w:tcMar>
+            <w:vAlign w:val="center"/>
+            <w:hideMark/>
+          </w:tcPr>
+          <w:p>
+            <w:pPr>
+              <w:rPr>
+                <w:lang w:val="es-ES"/>
+              </w:rPr>
+            </w:pPr>
+          </w:p>
+        </w:tc>
+        <w:tc>
+          <w:tcPr>
+            <w:tcW w:w="0" w:type="auto"/>
+            <w:tcBorders>
+              <w:top w:val="single" w:sz="6" w:space="0" w:color="auto"/>
+              <w:left w:val="single" w:sz="6" w:space="0" w:color="auto"/>
+              <w:bottom w:val="single" w:sz="6" w:space="0" w:color="auto"/>
+              <w:right w:val="single" w:sz="6" w:space="0" w:color="auto"/>
+            </w:tcBorders>
+            <w:tcMar>
+              <w:top w:w="120" w:type="dxa"/>
+              <w:left w:w="180" w:type="dxa"/>
+              <w:bottom w:w="120" w:type="dxa"/>
+              <w:right w:w="180" w:type="dxa"/>
+            </w:tcMar>
+            <w:vAlign w:val="center"/>
+            <w:hideMark/>
+          </w:tcPr>
+          <w:p>
+            <w:pPr>
+              <w:rPr>
+                <w:lang w:val="es-ES"/>
+              </w:rPr>
+            </w:pPr>
+            <w:r>
+              <w:rPr>
+                <w:lang w:val="es-ES"/>
+              </w:rPr>
+              <w:t>Herramientas filtradas:</w:t>
+            </w:r>
+          </w:p>
+          <w:p>
+            <w:pPr>
+              <w:rPr>
+                <w:lang w:val="es-ES"/>
+              </w:rPr>
+            </w:pPr>
+            <w:r>
+              <w:rPr>
+                <w:lang w:val="es-ES"/>
+              </w:rPr>
+              <w:br/>
+            </w:r>
+          </w:p>
+          <w:p>
+            <w:pPr>
+              <w:rPr>
+                <w:lang w:val="es-ES"/>
+              </w:rPr>
+            </w:pPr>
+            <w:r>
+              <w:rPr>
+                <w:lang w:val="es-ES"/>
+              </w:rPr>
+              <w:t>{Martillo, Jaime, Hierro, 30}</w:t>
+            </w:r>
+          </w:p>
+          <w:p>
+            <w:pPr>
+              <w:rPr>
+                <w:lang w:val="es-ES"/>
+              </w:rPr>
+            </w:pPr>
+            <w:r>
+              <w:rPr>
+                <w:lang w:val="es-ES"/>
+              </w:rPr>
+              <w:br/>
+            </w:r>
+          </w:p>
+          <w:p>
+            <w:pPr>
+              <w:rPr>
+                <w:lang w:val="es-ES"/>
+              </w:rPr>
+            </w:pPr>
+            <w:r>
+              <w:rPr>
+                <w:lang w:val="es-ES"/>
+              </w:rPr>
+              <w:t>{Destornillador, Daniel Balan, Hierro, 25}</w:t>
             </w:r>
           </w:p>
         </w:tc>
       </w:tr>
       <w:tr>
-        <w:tc>
-          <w:tcPr>
-            <w:tcW w:w="1011" w:type="dxa"/>
-            <w:vAlign w:val="center"/>
-          </w:tcPr>
-          <w:p>
-            <w:pPr>
-              <w:rPr>
-                <w:lang w:val="es-ES"/>
-              </w:rPr>
-            </w:pPr>
-            <w:r>
-              <w:rPr>
-                <w:rFonts w:ascii="Arial" w:hAnsi="Arial" w:cs="Arial"/>
+        <w:trPr>
+          <w:tblCellSpacing w:w="15" w:type="dxa"/>
+        </w:trPr>
+        <w:tc>
+          <w:tcPr>
+            <w:tcW w:w="0" w:type="auto"/>
+            <w:tcBorders>
+              <w:top w:val="single" w:sz="6" w:space="0" w:color="auto"/>
+              <w:left w:val="single" w:sz="6" w:space="0" w:color="auto"/>
+              <w:bottom w:val="single" w:sz="6" w:space="0" w:color="auto"/>
+              <w:right w:val="single" w:sz="6" w:space="0" w:color="auto"/>
+            </w:tcBorders>
+            <w:tcMar>
+              <w:top w:w="120" w:type="dxa"/>
+              <w:left w:w="180" w:type="dxa"/>
+              <w:bottom w:w="120" w:type="dxa"/>
+              <w:right w:w="180" w:type="dxa"/>
+            </w:tcMar>
+            <w:vAlign w:val="center"/>
+            <w:hideMark/>
+          </w:tcPr>
+          <w:p>
+            <w:pPr>
+              <w:rPr>
                 <w:b/>
                 <w:bCs/>
-                <w:color w:val="1F1F1F"/>
-                <w:bdr w:val="none" w:sz="0" w:space="0" w:color="auto" w:frame="1"/>
-              </w:rPr>
-              <w:t>Esc-2</w:t>
-            </w:r>
-          </w:p>
-        </w:tc>
-        <w:tc>
-          <w:tcPr>
-            <w:tcW w:w="1833" w:type="dxa"/>
-            <w:vAlign w:val="center"/>
-          </w:tcPr>
-          <w:p>
-            <w:pPr>
-              <w:pStyle w:val="NormalWeb"/>
-              <w:spacing w:before="0" w:beforeAutospacing="0" w:after="0" w:afterAutospacing="0"/>
-              <w:rPr>
-                <w:rFonts w:ascii="Arial" w:hAnsi="Arial" w:cs="Arial"/>
-                <w:color w:val="1F1F1F"/>
-              </w:rPr>
-            </w:pPr>
-            <w:r>
-              <w:rPr>
-                <w:rFonts w:ascii="Arial" w:hAnsi="Arial" w:cs="Arial"/>
+                <w:lang w:val="es-ES"/>
+              </w:rPr>
+            </w:pPr>
+          </w:p>
+          <w:p>
+            <w:pPr>
+              <w:rPr>
+                <w:lang w:val="es-ES"/>
+              </w:rPr>
+            </w:pPr>
+            <w:r>
+              <w:rPr>
                 <w:b/>
                 <w:bCs/>
-                <w:color w:val="1F1F1F"/>
-                <w:bdr w:val="none" w:sz="0" w:space="0" w:color="auto" w:frame="1"/>
-              </w:rPr>
-              <w:t>Filtrar herramientas</w:t>
-            </w:r>
-          </w:p>
-          <w:p>
-            <w:pPr>
-              <w:rPr>
-                <w:rFonts w:ascii="Arial" w:hAnsi="Arial" w:cs="Arial"/>
-                <w:color w:val="1F1F1F"/>
-              </w:rPr>
-            </w:pPr>
-            <w:r>
-              <w:rPr>
-                <w:rFonts w:ascii="Arial" w:hAnsi="Arial" w:cs="Arial"/>
-                <w:color w:val="1F1F1F"/>
-              </w:rPr>
-              <w:br/>
-            </w:r>
-          </w:p>
-          <w:p>
-            <w:pPr>
-              <w:rPr>
-                <w:lang w:val="es-ES"/>
-              </w:rPr>
-            </w:pPr>
-            <w:r>
-              <w:rPr>
-                <w:rFonts w:ascii="Arial" w:hAnsi="Arial" w:cs="Arial"/>
-                <w:color w:val="1F1F1F"/>
-                <w:lang w:val="es-ES"/>
-              </w:rPr>
-              <w:t>(Por Nombre, Material o Precio)</w:t>
-            </w:r>
-          </w:p>
-        </w:tc>
-        <w:tc>
-          <w:tcPr>
-            <w:tcW w:w="1748" w:type="dxa"/>
-            <w:vAlign w:val="center"/>
-          </w:tcPr>
-          <w:p>
-            <w:pPr>
-              <w:rPr>
-                <w:lang w:val="es-ES"/>
-              </w:rPr>
-            </w:pPr>
-            <w:r>
-              <w:rPr>
-                <w:rFonts w:ascii="Arial" w:hAnsi="Arial" w:cs="Arial"/>
+                <w:lang w:val="es-ES"/>
+              </w:rPr>
+              <w:t>CU_C_4</w:t>
+            </w:r>
+          </w:p>
+        </w:tc>
+        <w:tc>
+          <w:tcPr>
+            <w:tcW w:w="0" w:type="auto"/>
+            <w:tcBorders>
+              <w:top w:val="single" w:sz="6" w:space="0" w:color="auto"/>
+              <w:left w:val="single" w:sz="6" w:space="0" w:color="auto"/>
+              <w:bottom w:val="single" w:sz="6" w:space="0" w:color="auto"/>
+              <w:right w:val="single" w:sz="6" w:space="0" w:color="auto"/>
+            </w:tcBorders>
+            <w:tcMar>
+              <w:top w:w="120" w:type="dxa"/>
+              <w:left w:w="180" w:type="dxa"/>
+              <w:bottom w:w="120" w:type="dxa"/>
+              <w:right w:w="180" w:type="dxa"/>
+            </w:tcMar>
+            <w:vAlign w:val="center"/>
+            <w:hideMark/>
+          </w:tcPr>
+          <w:p>
+            <w:pPr>
+              <w:rPr>
                 <w:b/>
                 <w:bCs/>
-                <w:color w:val="1F1F1F"/>
-                <w:bdr w:val="none" w:sz="0" w:space="0" w:color="auto" w:frame="1"/>
-              </w:rPr>
-              <w:t>FB + FA0</w:t>
-            </w:r>
-          </w:p>
-        </w:tc>
-        <w:tc>
-          <w:tcPr>
-            <w:tcW w:w="3217" w:type="dxa"/>
-            <w:vAlign w:val="center"/>
-          </w:tcPr>
-          <w:p>
-            <w:pPr>
-              <w:rPr>
-                <w:lang w:val="es-ES"/>
-              </w:rPr>
-            </w:pPr>
-            <w:r>
-              <w:rPr>
-                <w:rStyle w:val="CdigoHTML"/>
-                <w:rFonts w:cs="Arial"/>
-                <w:color w:val="444746"/>
-                <w:bdr w:val="none" w:sz="0" w:space="0" w:color="auto" w:frame="1"/>
-              </w:rPr>
-              <w:t>CU3_FA0_Filtro</w:t>
-            </w:r>
-          </w:p>
-        </w:tc>
-        <w:tc>
-          <w:tcPr>
-            <w:tcW w:w="1113" w:type="dxa"/>
-            <w:vAlign w:val="center"/>
-          </w:tcPr>
-          <w:p>
-            <w:pPr>
-              <w:rPr>
-                <w:lang w:val="es-ES"/>
-              </w:rPr>
-            </w:pPr>
-            <w:r>
-              <w:rPr>
-                <w:rFonts w:ascii="Arial" w:hAnsi="Arial" w:cs="Arial"/>
+                <w:lang w:val="es-ES"/>
+              </w:rPr>
+            </w:pPr>
+          </w:p>
+          <w:p>
+            <w:pPr>
+              <w:rPr>
+                <w:lang w:val="es-ES"/>
+              </w:rPr>
+            </w:pPr>
+            <w:r>
+              <w:rPr>
                 <w:b/>
                 <w:bCs/>
-                <w:color w:val="1F1F1F"/>
-                <w:bdr w:val="none" w:sz="0" w:space="0" w:color="auto" w:frame="1"/>
-              </w:rPr>
-              <w:t>Esc-2</w:t>
-            </w:r>
-          </w:p>
-        </w:tc>
-        <w:tc>
-          <w:tcPr>
-            <w:tcW w:w="1806" w:type="dxa"/>
-            <w:vAlign w:val="center"/>
-          </w:tcPr>
-          <w:p>
-            <w:pPr>
-              <w:pStyle w:val="NormalWeb"/>
-              <w:spacing w:before="0" w:beforeAutospacing="0" w:after="0" w:afterAutospacing="0"/>
-              <w:rPr>
-                <w:rFonts w:ascii="Arial" w:hAnsi="Arial" w:cs="Arial"/>
-                <w:color w:val="1F1F1F"/>
-              </w:rPr>
-            </w:pPr>
-            <w:r>
-              <w:rPr>
-                <w:rFonts w:ascii="Arial" w:hAnsi="Arial" w:cs="Arial"/>
+                <w:lang w:val="es-ES"/>
+              </w:rPr>
+              <w:t>Esc-2/Filtro Precio</w:t>
+            </w:r>
+          </w:p>
+        </w:tc>
+        <w:tc>
+          <w:tcPr>
+            <w:tcW w:w="0" w:type="auto"/>
+            <w:tcBorders>
+              <w:top w:val="single" w:sz="6" w:space="0" w:color="auto"/>
+              <w:left w:val="single" w:sz="6" w:space="0" w:color="auto"/>
+              <w:bottom w:val="single" w:sz="6" w:space="0" w:color="auto"/>
+              <w:right w:val="single" w:sz="6" w:space="0" w:color="auto"/>
+            </w:tcBorders>
+            <w:tcMar>
+              <w:top w:w="120" w:type="dxa"/>
+              <w:left w:w="180" w:type="dxa"/>
+              <w:bottom w:w="120" w:type="dxa"/>
+              <w:right w:w="180" w:type="dxa"/>
+            </w:tcMar>
+            <w:vAlign w:val="center"/>
+            <w:hideMark/>
+          </w:tcPr>
+          <w:p>
+            <w:pPr>
+              <w:rPr>
+                <w:lang w:val="es-ES"/>
+              </w:rPr>
+            </w:pPr>
+            <w:r>
+              <w:rPr>
+                <w:lang w:val="es-ES"/>
+              </w:rPr>
+              <w:t>Lista de herramientas disponibles</w:t>
+            </w:r>
+          </w:p>
+        </w:tc>
+        <w:tc>
+          <w:tcPr>
+            <w:tcW w:w="0" w:type="auto"/>
+            <w:tcBorders>
+              <w:top w:val="single" w:sz="6" w:space="0" w:color="auto"/>
+              <w:left w:val="single" w:sz="6" w:space="0" w:color="auto"/>
+              <w:bottom w:val="single" w:sz="6" w:space="0" w:color="auto"/>
+              <w:right w:val="single" w:sz="6" w:space="0" w:color="auto"/>
+            </w:tcBorders>
+            <w:tcMar>
+              <w:top w:w="120" w:type="dxa"/>
+              <w:left w:w="180" w:type="dxa"/>
+              <w:bottom w:w="120" w:type="dxa"/>
+              <w:right w:w="180" w:type="dxa"/>
+            </w:tcMar>
+            <w:vAlign w:val="center"/>
+            <w:hideMark/>
+          </w:tcPr>
+          <w:p>
+            <w:pPr>
+              <w:rPr>
+                <w:lang w:val="es-ES"/>
+              </w:rPr>
+            </w:pPr>
+          </w:p>
+        </w:tc>
+        <w:tc>
+          <w:tcPr>
+            <w:tcW w:w="0" w:type="auto"/>
+            <w:tcBorders>
+              <w:top w:val="single" w:sz="6" w:space="0" w:color="auto"/>
+              <w:left w:val="single" w:sz="6" w:space="0" w:color="auto"/>
+              <w:bottom w:val="single" w:sz="6" w:space="0" w:color="auto"/>
+              <w:right w:val="single" w:sz="6" w:space="0" w:color="auto"/>
+            </w:tcBorders>
+            <w:tcMar>
+              <w:top w:w="120" w:type="dxa"/>
+              <w:left w:w="180" w:type="dxa"/>
+              <w:bottom w:w="120" w:type="dxa"/>
+              <w:right w:w="180" w:type="dxa"/>
+            </w:tcMar>
+            <w:vAlign w:val="center"/>
+            <w:hideMark/>
+          </w:tcPr>
+          <w:p>
+            <w:pPr>
+              <w:rPr>
+                <w:lang w:val="es-ES"/>
+              </w:rPr>
+            </w:pPr>
+          </w:p>
+        </w:tc>
+        <w:tc>
+          <w:tcPr>
+            <w:tcW w:w="0" w:type="auto"/>
+            <w:tcBorders>
+              <w:top w:val="single" w:sz="6" w:space="0" w:color="auto"/>
+              <w:left w:val="single" w:sz="6" w:space="0" w:color="auto"/>
+              <w:bottom w:val="single" w:sz="6" w:space="0" w:color="auto"/>
+              <w:right w:val="single" w:sz="6" w:space="0" w:color="auto"/>
+            </w:tcBorders>
+            <w:tcMar>
+              <w:top w:w="120" w:type="dxa"/>
+              <w:left w:w="180" w:type="dxa"/>
+              <w:bottom w:w="120" w:type="dxa"/>
+              <w:right w:w="180" w:type="dxa"/>
+            </w:tcMar>
+            <w:vAlign w:val="center"/>
+            <w:hideMark/>
+          </w:tcPr>
+          <w:p>
+            <w:pPr>
+              <w:rPr>
+                <w:lang w:val="es-ES"/>
+              </w:rPr>
+            </w:pPr>
+            <w:r>
+              <w:rPr>
+                <w:lang w:val="es-ES"/>
+              </w:rPr>
+              <w:t>28</w:t>
+            </w:r>
+          </w:p>
+        </w:tc>
+        <w:tc>
+          <w:tcPr>
+            <w:tcW w:w="0" w:type="auto"/>
+            <w:tcBorders>
+              <w:top w:val="single" w:sz="6" w:space="0" w:color="auto"/>
+              <w:left w:val="single" w:sz="6" w:space="0" w:color="auto"/>
+              <w:bottom w:val="single" w:sz="6" w:space="0" w:color="auto"/>
+              <w:right w:val="single" w:sz="6" w:space="0" w:color="auto"/>
+            </w:tcBorders>
+            <w:tcMar>
+              <w:top w:w="120" w:type="dxa"/>
+              <w:left w:w="180" w:type="dxa"/>
+              <w:bottom w:w="120" w:type="dxa"/>
+              <w:right w:w="180" w:type="dxa"/>
+            </w:tcMar>
+            <w:vAlign w:val="center"/>
+            <w:hideMark/>
+          </w:tcPr>
+          <w:p>
+            <w:pPr>
+              <w:rPr>
+                <w:lang w:val="es-ES"/>
+              </w:rPr>
+            </w:pPr>
+          </w:p>
+        </w:tc>
+        <w:tc>
+          <w:tcPr>
+            <w:tcW w:w="0" w:type="auto"/>
+            <w:tcBorders>
+              <w:top w:val="single" w:sz="6" w:space="0" w:color="auto"/>
+              <w:left w:val="single" w:sz="6" w:space="0" w:color="auto"/>
+              <w:bottom w:val="single" w:sz="6" w:space="0" w:color="auto"/>
+              <w:right w:val="single" w:sz="6" w:space="0" w:color="auto"/>
+            </w:tcBorders>
+            <w:tcMar>
+              <w:top w:w="120" w:type="dxa"/>
+              <w:left w:w="180" w:type="dxa"/>
+              <w:bottom w:w="120" w:type="dxa"/>
+              <w:right w:w="180" w:type="dxa"/>
+            </w:tcMar>
+            <w:vAlign w:val="center"/>
+            <w:hideMark/>
+          </w:tcPr>
+          <w:p>
+            <w:pPr>
+              <w:rPr>
+                <w:lang w:val="es-ES"/>
+              </w:rPr>
+            </w:pPr>
+            <w:r>
+              <w:rPr>
+                <w:lang w:val="es-ES"/>
+              </w:rPr>
+              <w:t>Herramientas filtradas:</w:t>
+            </w:r>
+          </w:p>
+          <w:p>
+            <w:pPr>
+              <w:rPr>
+                <w:lang w:val="es-ES"/>
+              </w:rPr>
+            </w:pPr>
+            <w:r>
+              <w:rPr>
+                <w:lang w:val="es-ES"/>
+              </w:rPr>
+              <w:br/>
+            </w:r>
+          </w:p>
+          <w:p>
+            <w:pPr>
+              <w:rPr>
+                <w:lang w:val="es-ES"/>
+              </w:rPr>
+            </w:pPr>
+            <w:r>
+              <w:rPr>
+                <w:lang w:val="es-ES"/>
+              </w:rPr>
+              <w:t>{Destornillador, Daniel Balan, Hierro, 25}</w:t>
+            </w:r>
+          </w:p>
+        </w:tc>
+      </w:tr>
+      <w:tr>
+        <w:trPr>
+          <w:tblCellSpacing w:w="15" w:type="dxa"/>
+        </w:trPr>
+        <w:tc>
+          <w:tcPr>
+            <w:tcW w:w="0" w:type="auto"/>
+            <w:tcBorders>
+              <w:top w:val="single" w:sz="6" w:space="0" w:color="auto"/>
+              <w:left w:val="single" w:sz="6" w:space="0" w:color="auto"/>
+              <w:bottom w:val="single" w:sz="6" w:space="0" w:color="auto"/>
+              <w:right w:val="single" w:sz="6" w:space="0" w:color="auto"/>
+            </w:tcBorders>
+            <w:tcMar>
+              <w:top w:w="120" w:type="dxa"/>
+              <w:left w:w="180" w:type="dxa"/>
+              <w:bottom w:w="120" w:type="dxa"/>
+              <w:right w:w="180" w:type="dxa"/>
+            </w:tcMar>
+            <w:vAlign w:val="center"/>
+            <w:hideMark/>
+          </w:tcPr>
+          <w:p>
+            <w:pPr>
+              <w:rPr>
+                <w:lang w:val="es-ES"/>
+              </w:rPr>
+            </w:pPr>
+            <w:r>
+              <w:rPr>
                 <w:b/>
                 <w:bCs/>
-                <w:color w:val="1F1F1F"/>
-                <w:bdr w:val="none" w:sz="0" w:space="0" w:color="auto" w:frame="1"/>
-              </w:rPr>
-              <w:t>Filtrar herramientas</w:t>
-            </w:r>
-          </w:p>
-          <w:p>
-            <w:pPr>
-              <w:rPr>
-                <w:rFonts w:ascii="Arial" w:hAnsi="Arial" w:cs="Arial"/>
-                <w:color w:val="1F1F1F"/>
-                <w:lang w:val="es-ES"/>
-              </w:rPr>
-            </w:pPr>
-            <w:r>
-              <w:rPr>
-                <w:rFonts w:ascii="Arial" w:hAnsi="Arial" w:cs="Arial"/>
-                <w:color w:val="1F1F1F"/>
-                <w:lang w:val="es-ES"/>
-              </w:rPr>
-              <w:br/>
-            </w:r>
-          </w:p>
-          <w:p>
-            <w:pPr>
-              <w:rPr>
-                <w:lang w:val="es-ES"/>
-              </w:rPr>
-            </w:pPr>
-            <w:r>
-              <w:rPr>
-                <w:rFonts w:ascii="Arial" w:hAnsi="Arial" w:cs="Arial"/>
-                <w:color w:val="1F1F1F"/>
-                <w:lang w:val="es-ES"/>
-              </w:rPr>
-              <w:t>(Por Nombre, Material o Precio)</w:t>
-            </w:r>
-          </w:p>
-        </w:tc>
-        <w:tc>
-          <w:tcPr>
-            <w:tcW w:w="2085" w:type="dxa"/>
-            <w:vAlign w:val="center"/>
-          </w:tcPr>
-          <w:p>
-            <w:pPr>
-              <w:rPr>
-                <w:lang w:val="es-ES"/>
-              </w:rPr>
-            </w:pPr>
-            <w:r>
-              <w:rPr>
-                <w:rFonts w:ascii="Arial" w:hAnsi="Arial" w:cs="Arial"/>
+                <w:lang w:val="es-ES"/>
+              </w:rPr>
+              <w:t>CU_C_5</w:t>
+            </w:r>
+          </w:p>
+        </w:tc>
+        <w:tc>
+          <w:tcPr>
+            <w:tcW w:w="0" w:type="auto"/>
+            <w:tcBorders>
+              <w:top w:val="single" w:sz="6" w:space="0" w:color="auto"/>
+              <w:left w:val="single" w:sz="6" w:space="0" w:color="auto"/>
+              <w:bottom w:val="single" w:sz="6" w:space="0" w:color="auto"/>
+              <w:right w:val="single" w:sz="6" w:space="0" w:color="auto"/>
+            </w:tcBorders>
+            <w:tcMar>
+              <w:top w:w="120" w:type="dxa"/>
+              <w:left w:w="180" w:type="dxa"/>
+              <w:bottom w:w="120" w:type="dxa"/>
+              <w:right w:w="180" w:type="dxa"/>
+            </w:tcMar>
+            <w:vAlign w:val="center"/>
+            <w:hideMark/>
+          </w:tcPr>
+          <w:p>
+            <w:pPr>
+              <w:rPr>
+                <w:lang w:val="es-ES"/>
+              </w:rPr>
+            </w:pPr>
+            <w:r>
+              <w:rPr>
                 <w:b/>
                 <w:bCs/>
-                <w:color w:val="1F1F1F"/>
-                <w:bdr w:val="none" w:sz="0" w:space="0" w:color="auto" w:frame="1"/>
-              </w:rPr>
-              <w:t>FB + FA0</w:t>
+                <w:lang w:val="es-ES"/>
+              </w:rPr>
+              <w:t>Esc-3/Error Datos</w:t>
+            </w:r>
+          </w:p>
+        </w:tc>
+        <w:tc>
+          <w:tcPr>
+            <w:tcW w:w="0" w:type="auto"/>
+            <w:tcBorders>
+              <w:top w:val="single" w:sz="6" w:space="0" w:color="auto"/>
+              <w:left w:val="single" w:sz="6" w:space="0" w:color="auto"/>
+              <w:bottom w:val="single" w:sz="6" w:space="0" w:color="auto"/>
+              <w:right w:val="single" w:sz="6" w:space="0" w:color="auto"/>
+            </w:tcBorders>
+            <w:tcMar>
+              <w:top w:w="120" w:type="dxa"/>
+              <w:left w:w="180" w:type="dxa"/>
+              <w:bottom w:w="120" w:type="dxa"/>
+              <w:right w:w="180" w:type="dxa"/>
+            </w:tcMar>
+            <w:vAlign w:val="center"/>
+            <w:hideMark/>
+          </w:tcPr>
+          <w:p>
+            <w:pPr>
+              <w:rPr>
+                <w:lang w:val="es-ES"/>
+              </w:rPr>
+            </w:pPr>
+            <w:r>
+              <w:rPr>
+                <w:lang w:val="es-ES"/>
+              </w:rPr>
+              <w:t>Lista de herramientas disponibles</w:t>
+            </w:r>
+          </w:p>
+        </w:tc>
+        <w:tc>
+          <w:tcPr>
+            <w:tcW w:w="0" w:type="auto"/>
+            <w:tcBorders>
+              <w:top w:val="single" w:sz="6" w:space="0" w:color="auto"/>
+              <w:left w:val="single" w:sz="6" w:space="0" w:color="auto"/>
+              <w:bottom w:val="single" w:sz="6" w:space="0" w:color="auto"/>
+              <w:right w:val="single" w:sz="6" w:space="0" w:color="auto"/>
+            </w:tcBorders>
+            <w:tcMar>
+              <w:top w:w="120" w:type="dxa"/>
+              <w:left w:w="180" w:type="dxa"/>
+              <w:bottom w:w="120" w:type="dxa"/>
+              <w:right w:w="180" w:type="dxa"/>
+            </w:tcMar>
+            <w:vAlign w:val="center"/>
+            <w:hideMark/>
+          </w:tcPr>
+          <w:p>
+            <w:pPr>
+              <w:rPr>
+                <w:lang w:val="es-ES"/>
+              </w:rPr>
+            </w:pPr>
+          </w:p>
+        </w:tc>
+        <w:tc>
+          <w:tcPr>
+            <w:tcW w:w="0" w:type="auto"/>
+            <w:tcBorders>
+              <w:top w:val="single" w:sz="6" w:space="0" w:color="auto"/>
+              <w:left w:val="single" w:sz="6" w:space="0" w:color="auto"/>
+              <w:bottom w:val="single" w:sz="6" w:space="0" w:color="auto"/>
+              <w:right w:val="single" w:sz="6" w:space="0" w:color="auto"/>
+            </w:tcBorders>
+            <w:tcMar>
+              <w:top w:w="120" w:type="dxa"/>
+              <w:left w:w="180" w:type="dxa"/>
+              <w:bottom w:w="120" w:type="dxa"/>
+              <w:right w:w="180" w:type="dxa"/>
+            </w:tcMar>
+            <w:vAlign w:val="center"/>
+            <w:hideMark/>
+          </w:tcPr>
+          <w:p>
+            <w:pPr>
+              <w:rPr>
+                <w:lang w:val="es-ES"/>
+              </w:rPr>
+            </w:pPr>
+          </w:p>
+        </w:tc>
+        <w:tc>
+          <w:tcPr>
+            <w:tcW w:w="0" w:type="auto"/>
+            <w:tcBorders>
+              <w:top w:val="single" w:sz="6" w:space="0" w:color="auto"/>
+              <w:left w:val="single" w:sz="6" w:space="0" w:color="auto"/>
+              <w:bottom w:val="single" w:sz="6" w:space="0" w:color="auto"/>
+              <w:right w:val="single" w:sz="6" w:space="0" w:color="auto"/>
+            </w:tcBorders>
+            <w:tcMar>
+              <w:top w:w="120" w:type="dxa"/>
+              <w:left w:w="180" w:type="dxa"/>
+              <w:bottom w:w="120" w:type="dxa"/>
+              <w:right w:w="180" w:type="dxa"/>
+            </w:tcMar>
+            <w:vAlign w:val="center"/>
+            <w:hideMark/>
+          </w:tcPr>
+          <w:p>
+            <w:pPr>
+              <w:rPr>
+                <w:lang w:val="es-ES"/>
+              </w:rPr>
+            </w:pPr>
+          </w:p>
+        </w:tc>
+        <w:tc>
+          <w:tcPr>
+            <w:tcW w:w="0" w:type="auto"/>
+            <w:tcBorders>
+              <w:top w:val="single" w:sz="6" w:space="0" w:color="auto"/>
+              <w:left w:val="single" w:sz="6" w:space="0" w:color="auto"/>
+              <w:bottom w:val="single" w:sz="6" w:space="0" w:color="auto"/>
+              <w:right w:val="single" w:sz="6" w:space="0" w:color="auto"/>
+            </w:tcBorders>
+            <w:tcMar>
+              <w:top w:w="120" w:type="dxa"/>
+              <w:left w:w="180" w:type="dxa"/>
+              <w:bottom w:w="120" w:type="dxa"/>
+              <w:right w:w="180" w:type="dxa"/>
+            </w:tcMar>
+            <w:vAlign w:val="center"/>
+            <w:hideMark/>
+          </w:tcPr>
+          <w:p>
+            <w:pPr>
+              <w:rPr>
+                <w:lang w:val="es-ES"/>
+              </w:rPr>
+            </w:pPr>
+            <w:r>
+              <w:rPr>
+                <w:lang w:val="es-ES"/>
+              </w:rPr>
+              <w:t xml:space="preserve">"", Simpson, Calle 1, </w:t>
+            </w:r>
+            <w:proofErr w:type="spellStart"/>
+            <w:r>
+              <w:rPr>
+                <w:lang w:val="es-ES"/>
+              </w:rPr>
+              <w:t>TarjetaCredito</w:t>
+            </w:r>
+            <w:proofErr w:type="spellEnd"/>
+            <w:r>
+              <w:rPr>
+                <w:lang w:val="es-ES"/>
+              </w:rPr>
+              <w:t>, 1, "Test"</w:t>
+            </w:r>
+          </w:p>
+        </w:tc>
+        <w:tc>
+          <w:tcPr>
+            <w:tcW w:w="0" w:type="auto"/>
+            <w:tcBorders>
+              <w:top w:val="single" w:sz="6" w:space="0" w:color="auto"/>
+              <w:left w:val="single" w:sz="6" w:space="0" w:color="auto"/>
+              <w:bottom w:val="single" w:sz="6" w:space="0" w:color="auto"/>
+              <w:right w:val="single" w:sz="6" w:space="0" w:color="auto"/>
+            </w:tcBorders>
+            <w:tcMar>
+              <w:top w:w="120" w:type="dxa"/>
+              <w:left w:w="180" w:type="dxa"/>
+              <w:bottom w:w="120" w:type="dxa"/>
+              <w:right w:w="180" w:type="dxa"/>
+            </w:tcMar>
+            <w:vAlign w:val="center"/>
+            <w:hideMark/>
+          </w:tcPr>
+          <w:p>
+            <w:pPr>
+              <w:rPr>
+                <w:lang w:val="es-ES"/>
+              </w:rPr>
+            </w:pPr>
+            <w:r>
+              <w:rPr>
+                <w:lang w:val="es-ES"/>
+              </w:rPr>
+              <w:t>Error en validación:</w:t>
+            </w:r>
+          </w:p>
+          <w:p>
+            <w:pPr>
+              <w:rPr>
+                <w:lang w:val="es-ES"/>
+              </w:rPr>
+            </w:pPr>
+            <w:r>
+              <w:rPr>
+                <w:lang w:val="es-ES"/>
+              </w:rPr>
+              <w:br/>
+            </w:r>
+          </w:p>
+          <w:p>
+            <w:pPr>
+              <w:rPr>
+                <w:lang w:val="es-ES"/>
+              </w:rPr>
+            </w:pPr>
+            <w:r>
+              <w:rPr>
+                <w:lang w:val="es-ES"/>
+              </w:rPr>
+              <w:t>"</w:t>
+            </w:r>
+            <w:proofErr w:type="spellStart"/>
+            <w:r>
+              <w:rPr>
+                <w:lang w:val="es-ES"/>
+              </w:rPr>
+              <w:t>The</w:t>
+            </w:r>
+            <w:proofErr w:type="spellEnd"/>
+            <w:r>
+              <w:rPr>
+                <w:lang w:val="es-ES"/>
+              </w:rPr>
+              <w:t xml:space="preserve"> </w:t>
+            </w:r>
+            <w:proofErr w:type="spellStart"/>
+            <w:r>
+              <w:rPr>
+                <w:lang w:val="es-ES"/>
+              </w:rPr>
+              <w:t>NombreCliente</w:t>
+            </w:r>
+            <w:proofErr w:type="spellEnd"/>
+            <w:r>
+              <w:rPr>
+                <w:lang w:val="es-ES"/>
+              </w:rPr>
+              <w:t xml:space="preserve"> </w:t>
+            </w:r>
+            <w:proofErr w:type="spellStart"/>
+            <w:r>
+              <w:rPr>
+                <w:lang w:val="es-ES"/>
+              </w:rPr>
+              <w:t>field</w:t>
+            </w:r>
+            <w:proofErr w:type="spellEnd"/>
+            <w:r>
+              <w:rPr>
+                <w:lang w:val="es-ES"/>
+              </w:rPr>
+              <w:t xml:space="preserve"> </w:t>
+            </w:r>
+            <w:proofErr w:type="spellStart"/>
+            <w:r>
+              <w:rPr>
+                <w:lang w:val="es-ES"/>
+              </w:rPr>
+              <w:t>is</w:t>
+            </w:r>
+            <w:proofErr w:type="spellEnd"/>
+            <w:r>
+              <w:rPr>
+                <w:lang w:val="es-ES"/>
+              </w:rPr>
+              <w:t xml:space="preserve"> </w:t>
+            </w:r>
+            <w:proofErr w:type="spellStart"/>
+            <w:r>
+              <w:rPr>
+                <w:lang w:val="es-ES"/>
+              </w:rPr>
+              <w:t>required</w:t>
+            </w:r>
+            <w:proofErr w:type="spellEnd"/>
+            <w:r>
+              <w:rPr>
+                <w:lang w:val="es-ES"/>
+              </w:rPr>
+              <w:t>."</w:t>
             </w:r>
           </w:p>
         </w:tc>
       </w:tr>
       <w:tr>
-        <w:tc>
-          <w:tcPr>
-            <w:tcW w:w="1011" w:type="dxa"/>
-            <w:vAlign w:val="center"/>
-          </w:tcPr>
-          <w:p>
-            <w:pPr>
-              <w:rPr>
-                <w:lang w:val="es-ES"/>
-              </w:rPr>
-            </w:pPr>
-            <w:r>
-              <w:rPr>
-                <w:rFonts w:ascii="Arial" w:hAnsi="Arial" w:cs="Arial"/>
+        <w:trPr>
+          <w:tblCellSpacing w:w="15" w:type="dxa"/>
+        </w:trPr>
+        <w:tc>
+          <w:tcPr>
+            <w:tcW w:w="0" w:type="auto"/>
+            <w:tcBorders>
+              <w:top w:val="single" w:sz="6" w:space="0" w:color="auto"/>
+              <w:left w:val="single" w:sz="6" w:space="0" w:color="auto"/>
+              <w:bottom w:val="single" w:sz="6" w:space="0" w:color="auto"/>
+              <w:right w:val="single" w:sz="6" w:space="0" w:color="auto"/>
+            </w:tcBorders>
+            <w:tcMar>
+              <w:top w:w="120" w:type="dxa"/>
+              <w:left w:w="180" w:type="dxa"/>
+              <w:bottom w:w="120" w:type="dxa"/>
+              <w:right w:w="180" w:type="dxa"/>
+            </w:tcMar>
+            <w:vAlign w:val="center"/>
+            <w:hideMark/>
+          </w:tcPr>
+          <w:p>
+            <w:pPr>
+              <w:rPr>
+                <w:lang w:val="es-ES"/>
+              </w:rPr>
+            </w:pPr>
+            <w:r>
+              <w:rPr>
                 <w:b/>
                 <w:bCs/>
-                <w:color w:val="1F1F1F"/>
-                <w:bdr w:val="none" w:sz="0" w:space="0" w:color="auto" w:frame="1"/>
-              </w:rPr>
-              <w:t>Esc-3</w:t>
-            </w:r>
-          </w:p>
-        </w:tc>
-        <w:tc>
-          <w:tcPr>
-            <w:tcW w:w="1833" w:type="dxa"/>
-            <w:vAlign w:val="center"/>
-          </w:tcPr>
-          <w:p>
-            <w:pPr>
-              <w:pStyle w:val="NormalWeb"/>
-              <w:spacing w:before="0" w:beforeAutospacing="0" w:after="0" w:afterAutospacing="0"/>
-              <w:rPr>
-                <w:rFonts w:ascii="Arial" w:hAnsi="Arial" w:cs="Arial"/>
-                <w:color w:val="1F1F1F"/>
-              </w:rPr>
-            </w:pPr>
-            <w:r>
-              <w:rPr>
-                <w:rFonts w:ascii="Arial" w:hAnsi="Arial" w:cs="Arial"/>
+                <w:lang w:val="es-ES"/>
+              </w:rPr>
+              <w:t>CU_C_6</w:t>
+            </w:r>
+          </w:p>
+        </w:tc>
+        <w:tc>
+          <w:tcPr>
+            <w:tcW w:w="0" w:type="auto"/>
+            <w:tcBorders>
+              <w:top w:val="single" w:sz="6" w:space="0" w:color="auto"/>
+              <w:left w:val="single" w:sz="6" w:space="0" w:color="auto"/>
+              <w:bottom w:val="single" w:sz="6" w:space="0" w:color="auto"/>
+              <w:right w:val="single" w:sz="6" w:space="0" w:color="auto"/>
+            </w:tcBorders>
+            <w:tcMar>
+              <w:top w:w="120" w:type="dxa"/>
+              <w:left w:w="180" w:type="dxa"/>
+              <w:bottom w:w="120" w:type="dxa"/>
+              <w:right w:w="180" w:type="dxa"/>
+            </w:tcMar>
+            <w:vAlign w:val="center"/>
+            <w:hideMark/>
+          </w:tcPr>
+          <w:p>
+            <w:pPr>
+              <w:rPr>
+                <w:lang w:val="es-ES"/>
+              </w:rPr>
+            </w:pPr>
+            <w:r>
+              <w:rPr>
                 <w:b/>
                 <w:bCs/>
-                <w:color w:val="1F1F1F"/>
-                <w:bdr w:val="none" w:sz="0" w:space="0" w:color="auto" w:frame="1"/>
-              </w:rPr>
-              <w:t>Datos de compra incorrectos</w:t>
-            </w:r>
-          </w:p>
-          <w:p>
-            <w:pPr>
-              <w:rPr>
-                <w:rFonts w:ascii="Arial" w:hAnsi="Arial" w:cs="Arial"/>
-                <w:color w:val="1F1F1F"/>
-                <w:lang w:val="es-ES"/>
-              </w:rPr>
-            </w:pPr>
-            <w:r>
-              <w:rPr>
-                <w:rFonts w:ascii="Arial" w:hAnsi="Arial" w:cs="Arial"/>
-                <w:color w:val="1F1F1F"/>
-                <w:lang w:val="es-ES"/>
+                <w:lang w:val="es-ES"/>
+              </w:rPr>
+              <w:t>Esc-5/Error Herramienta</w:t>
+            </w:r>
+          </w:p>
+        </w:tc>
+        <w:tc>
+          <w:tcPr>
+            <w:tcW w:w="0" w:type="auto"/>
+            <w:tcBorders>
+              <w:top w:val="single" w:sz="6" w:space="0" w:color="auto"/>
+              <w:left w:val="single" w:sz="6" w:space="0" w:color="auto"/>
+              <w:bottom w:val="single" w:sz="6" w:space="0" w:color="auto"/>
+              <w:right w:val="single" w:sz="6" w:space="0" w:color="auto"/>
+            </w:tcBorders>
+            <w:tcMar>
+              <w:top w:w="120" w:type="dxa"/>
+              <w:left w:w="180" w:type="dxa"/>
+              <w:bottom w:w="120" w:type="dxa"/>
+              <w:right w:w="180" w:type="dxa"/>
+            </w:tcMar>
+            <w:vAlign w:val="center"/>
+            <w:hideMark/>
+          </w:tcPr>
+          <w:p>
+            <w:pPr>
+              <w:rPr>
+                <w:lang w:val="es-ES"/>
+              </w:rPr>
+            </w:pPr>
+            <w:r>
+              <w:rPr>
+                <w:lang w:val="es-ES"/>
+              </w:rPr>
+              <w:t>Lista de herramientas disponibles</w:t>
+            </w:r>
+          </w:p>
+        </w:tc>
+        <w:tc>
+          <w:tcPr>
+            <w:tcW w:w="0" w:type="auto"/>
+            <w:tcBorders>
+              <w:top w:val="single" w:sz="6" w:space="0" w:color="auto"/>
+              <w:left w:val="single" w:sz="6" w:space="0" w:color="auto"/>
+              <w:bottom w:val="single" w:sz="6" w:space="0" w:color="auto"/>
+              <w:right w:val="single" w:sz="6" w:space="0" w:color="auto"/>
+            </w:tcBorders>
+            <w:tcMar>
+              <w:top w:w="120" w:type="dxa"/>
+              <w:left w:w="180" w:type="dxa"/>
+              <w:bottom w:w="120" w:type="dxa"/>
+              <w:right w:w="180" w:type="dxa"/>
+            </w:tcMar>
+            <w:vAlign w:val="center"/>
+            <w:hideMark/>
+          </w:tcPr>
+          <w:p>
+            <w:pPr>
+              <w:rPr>
+                <w:lang w:val="es-ES"/>
+              </w:rPr>
+            </w:pPr>
+          </w:p>
+        </w:tc>
+        <w:tc>
+          <w:tcPr>
+            <w:tcW w:w="0" w:type="auto"/>
+            <w:tcBorders>
+              <w:top w:val="single" w:sz="6" w:space="0" w:color="auto"/>
+              <w:left w:val="single" w:sz="6" w:space="0" w:color="auto"/>
+              <w:bottom w:val="single" w:sz="6" w:space="0" w:color="auto"/>
+              <w:right w:val="single" w:sz="6" w:space="0" w:color="auto"/>
+            </w:tcBorders>
+            <w:tcMar>
+              <w:top w:w="120" w:type="dxa"/>
+              <w:left w:w="180" w:type="dxa"/>
+              <w:bottom w:w="120" w:type="dxa"/>
+              <w:right w:w="180" w:type="dxa"/>
+            </w:tcMar>
+            <w:vAlign w:val="center"/>
+            <w:hideMark/>
+          </w:tcPr>
+          <w:p>
+            <w:pPr>
+              <w:rPr>
+                <w:lang w:val="es-ES"/>
+              </w:rPr>
+            </w:pPr>
+          </w:p>
+        </w:tc>
+        <w:tc>
+          <w:tcPr>
+            <w:tcW w:w="0" w:type="auto"/>
+            <w:tcBorders>
+              <w:top w:val="single" w:sz="6" w:space="0" w:color="auto"/>
+              <w:left w:val="single" w:sz="6" w:space="0" w:color="auto"/>
+              <w:bottom w:val="single" w:sz="6" w:space="0" w:color="auto"/>
+              <w:right w:val="single" w:sz="6" w:space="0" w:color="auto"/>
+            </w:tcBorders>
+            <w:tcMar>
+              <w:top w:w="120" w:type="dxa"/>
+              <w:left w:w="180" w:type="dxa"/>
+              <w:bottom w:w="120" w:type="dxa"/>
+              <w:right w:w="180" w:type="dxa"/>
+            </w:tcMar>
+            <w:vAlign w:val="center"/>
+            <w:hideMark/>
+          </w:tcPr>
+          <w:p>
+            <w:pPr>
+              <w:rPr>
+                <w:lang w:val="es-ES"/>
+              </w:rPr>
+            </w:pPr>
+          </w:p>
+        </w:tc>
+        <w:tc>
+          <w:tcPr>
+            <w:tcW w:w="0" w:type="auto"/>
+            <w:tcBorders>
+              <w:top w:val="single" w:sz="6" w:space="0" w:color="auto"/>
+              <w:left w:val="single" w:sz="6" w:space="0" w:color="auto"/>
+              <w:bottom w:val="single" w:sz="6" w:space="0" w:color="auto"/>
+              <w:right w:val="single" w:sz="6" w:space="0" w:color="auto"/>
+            </w:tcBorders>
+            <w:tcMar>
+              <w:top w:w="120" w:type="dxa"/>
+              <w:left w:w="180" w:type="dxa"/>
+              <w:bottom w:w="120" w:type="dxa"/>
+              <w:right w:w="180" w:type="dxa"/>
+            </w:tcMar>
+            <w:vAlign w:val="center"/>
+            <w:hideMark/>
+          </w:tcPr>
+          <w:p>
+            <w:pPr>
+              <w:rPr>
+                <w:lang w:val="es-ES"/>
+              </w:rPr>
+            </w:pPr>
+            <w:proofErr w:type="spellStart"/>
+            <w:r>
+              <w:rPr>
+                <w:lang w:val="es-ES"/>
+              </w:rPr>
+              <w:t>Homer</w:t>
+            </w:r>
+            <w:proofErr w:type="spellEnd"/>
+            <w:r>
+              <w:rPr>
+                <w:lang w:val="es-ES"/>
+              </w:rPr>
+              <w:t xml:space="preserve">, Simpson, Calle 1, </w:t>
+            </w:r>
+            <w:proofErr w:type="spellStart"/>
+            <w:r>
+              <w:rPr>
+                <w:lang w:val="es-ES"/>
+              </w:rPr>
+              <w:t>TarjetaCredito</w:t>
+            </w:r>
+            <w:proofErr w:type="spellEnd"/>
+            <w:r>
+              <w:rPr>
+                <w:lang w:val="es-ES"/>
+              </w:rPr>
+              <w:t>, 0, "Test"</w:t>
+            </w:r>
+          </w:p>
+        </w:tc>
+        <w:tc>
+          <w:tcPr>
+            <w:tcW w:w="0" w:type="auto"/>
+            <w:tcBorders>
+              <w:top w:val="single" w:sz="6" w:space="0" w:color="auto"/>
+              <w:left w:val="single" w:sz="6" w:space="0" w:color="auto"/>
+              <w:bottom w:val="single" w:sz="6" w:space="0" w:color="auto"/>
+              <w:right w:val="single" w:sz="6" w:space="0" w:color="auto"/>
+            </w:tcBorders>
+            <w:tcMar>
+              <w:top w:w="120" w:type="dxa"/>
+              <w:left w:w="180" w:type="dxa"/>
+              <w:bottom w:w="120" w:type="dxa"/>
+              <w:right w:w="180" w:type="dxa"/>
+            </w:tcMar>
+            <w:vAlign w:val="center"/>
+            <w:hideMark/>
+          </w:tcPr>
+          <w:p>
+            <w:pPr>
+              <w:rPr>
+                <w:lang w:val="en-GB"/>
+              </w:rPr>
+            </w:pPr>
+            <w:r>
+              <w:rPr>
+                <w:lang w:val="en-GB"/>
+              </w:rPr>
+              <w:t xml:space="preserve">Error </w:t>
+            </w:r>
+            <w:proofErr w:type="spellStart"/>
+            <w:r>
+              <w:rPr>
+                <w:lang w:val="en-GB"/>
+              </w:rPr>
+              <w:t>en</w:t>
+            </w:r>
+            <w:proofErr w:type="spellEnd"/>
+            <w:r>
+              <w:rPr>
+                <w:lang w:val="en-GB"/>
+              </w:rPr>
+              <w:t xml:space="preserve"> </w:t>
+            </w:r>
+            <w:proofErr w:type="spellStart"/>
+            <w:r>
+              <w:rPr>
+                <w:lang w:val="en-GB"/>
+              </w:rPr>
+              <w:t>validación</w:t>
+            </w:r>
+            <w:proofErr w:type="spellEnd"/>
+            <w:r>
+              <w:rPr>
+                <w:lang w:val="en-GB"/>
+              </w:rPr>
+              <w:t>:</w:t>
+            </w:r>
+          </w:p>
+          <w:p>
+            <w:pPr>
+              <w:rPr>
+                <w:lang w:val="en-GB"/>
+              </w:rPr>
+            </w:pPr>
+            <w:r>
+              <w:rPr>
+                <w:lang w:val="en-GB"/>
               </w:rPr>
               <w:br/>
             </w:r>
@@ -2708,124 +4385,285 @@
           <w:p>
             <w:pPr>
               <w:rPr>
-                <w:lang w:val="es-ES"/>
-              </w:rPr>
-            </w:pPr>
-            <w:r>
-              <w:rPr>
-                <w:rFonts w:ascii="Arial" w:hAnsi="Arial" w:cs="Arial"/>
-                <w:color w:val="1F1F1F"/>
-                <w:lang w:val="es-ES"/>
-              </w:rPr>
-              <w:t>(Validación: falta nombre, apellido, etc.)</w:t>
-            </w:r>
-          </w:p>
-        </w:tc>
-        <w:tc>
-          <w:tcPr>
-            <w:tcW w:w="1748" w:type="dxa"/>
-            <w:vAlign w:val="center"/>
-          </w:tcPr>
-          <w:p>
-            <w:pPr>
-              <w:rPr>
-                <w:lang w:val="es-ES"/>
-              </w:rPr>
-            </w:pPr>
-            <w:r>
-              <w:rPr>
-                <w:rFonts w:ascii="Arial" w:hAnsi="Arial" w:cs="Arial"/>
+                <w:lang w:val="en-GB"/>
+              </w:rPr>
+            </w:pPr>
+            <w:r>
+              <w:rPr>
+                <w:lang w:val="en-GB"/>
+              </w:rPr>
+              <w:t xml:space="preserve">"The </w:t>
+            </w:r>
+            <w:proofErr w:type="spellStart"/>
+            <w:r>
+              <w:rPr>
+                <w:lang w:val="en-GB"/>
+              </w:rPr>
+              <w:t>Cantidad</w:t>
+            </w:r>
+            <w:proofErr w:type="spellEnd"/>
+            <w:r>
+              <w:rPr>
+                <w:lang w:val="en-GB"/>
+              </w:rPr>
+              <w:t xml:space="preserve"> field must be between 1 and..."</w:t>
+            </w:r>
+          </w:p>
+        </w:tc>
+      </w:tr>
+      <w:tr>
+        <w:trPr>
+          <w:tblCellSpacing w:w="15" w:type="dxa"/>
+        </w:trPr>
+        <w:tc>
+          <w:tcPr>
+            <w:tcW w:w="0" w:type="auto"/>
+            <w:tcBorders>
+              <w:top w:val="single" w:sz="6" w:space="0" w:color="auto"/>
+              <w:left w:val="single" w:sz="6" w:space="0" w:color="auto"/>
+              <w:bottom w:val="single" w:sz="6" w:space="0" w:color="auto"/>
+              <w:right w:val="single" w:sz="6" w:space="0" w:color="auto"/>
+            </w:tcBorders>
+            <w:tcMar>
+              <w:top w:w="120" w:type="dxa"/>
+              <w:left w:w="180" w:type="dxa"/>
+              <w:bottom w:w="120" w:type="dxa"/>
+              <w:right w:w="180" w:type="dxa"/>
+            </w:tcMar>
+            <w:vAlign w:val="center"/>
+            <w:hideMark/>
+          </w:tcPr>
+          <w:p>
+            <w:pPr>
+              <w:rPr>
+                <w:lang w:val="es-ES"/>
+              </w:rPr>
+            </w:pPr>
+            <w:r>
+              <w:rPr>
                 <w:b/>
                 <w:bCs/>
-                <w:color w:val="1F1F1F"/>
-                <w:bdr w:val="none" w:sz="0" w:space="0" w:color="auto" w:frame="1"/>
-              </w:rPr>
-              <w:t>FB + FA1</w:t>
-            </w:r>
-          </w:p>
-        </w:tc>
-        <w:tc>
-          <w:tcPr>
-            <w:tcW w:w="3217" w:type="dxa"/>
-            <w:vAlign w:val="center"/>
-          </w:tcPr>
-          <w:p>
-            <w:pPr>
-              <w:rPr>
-                <w:lang w:val="es-ES"/>
-              </w:rPr>
-            </w:pPr>
-            <w:r>
-              <w:rPr>
-                <w:rStyle w:val="CdigoHTML"/>
-                <w:rFonts w:cs="Arial"/>
-                <w:color w:val="444746"/>
-                <w:bdr w:val="none" w:sz="0" w:space="0" w:color="auto" w:frame="1"/>
-              </w:rPr>
-              <w:t>CU3_FA1_Errores</w:t>
-            </w:r>
-          </w:p>
-        </w:tc>
-        <w:tc>
-          <w:tcPr>
-            <w:tcW w:w="1113" w:type="dxa"/>
-            <w:vAlign w:val="center"/>
-          </w:tcPr>
-          <w:p>
-            <w:pPr>
-              <w:rPr>
-                <w:lang w:val="es-ES"/>
-              </w:rPr>
-            </w:pPr>
-            <w:r>
-              <w:rPr>
-                <w:rFonts w:ascii="Arial" w:hAnsi="Arial" w:cs="Arial"/>
+                <w:lang w:val="es-ES"/>
+              </w:rPr>
+              <w:t>CU_C_7</w:t>
+            </w:r>
+          </w:p>
+        </w:tc>
+        <w:tc>
+          <w:tcPr>
+            <w:tcW w:w="0" w:type="auto"/>
+            <w:tcBorders>
+              <w:top w:val="single" w:sz="6" w:space="0" w:color="auto"/>
+              <w:left w:val="single" w:sz="6" w:space="0" w:color="auto"/>
+              <w:bottom w:val="single" w:sz="6" w:space="0" w:color="auto"/>
+              <w:right w:val="single" w:sz="6" w:space="0" w:color="auto"/>
+            </w:tcBorders>
+            <w:tcMar>
+              <w:top w:w="120" w:type="dxa"/>
+              <w:left w:w="180" w:type="dxa"/>
+              <w:bottom w:w="120" w:type="dxa"/>
+              <w:right w:w="180" w:type="dxa"/>
+            </w:tcMar>
+            <w:vAlign w:val="center"/>
+            <w:hideMark/>
+          </w:tcPr>
+          <w:p>
+            <w:pPr>
+              <w:rPr>
+                <w:lang w:val="es-ES"/>
+              </w:rPr>
+            </w:pPr>
+            <w:r>
+              <w:rPr>
                 <w:b/>
                 <w:bCs/>
-                <w:color w:val="1F1F1F"/>
-                <w:bdr w:val="none" w:sz="0" w:space="0" w:color="auto" w:frame="1"/>
-              </w:rPr>
-              <w:t>Esc-3</w:t>
-            </w:r>
-          </w:p>
-        </w:tc>
-        <w:tc>
-          <w:tcPr>
-            <w:tcW w:w="1806" w:type="dxa"/>
-            <w:vAlign w:val="center"/>
-          </w:tcPr>
-          <w:p>
-            <w:pPr>
-              <w:pStyle w:val="NormalWeb"/>
-              <w:spacing w:before="0" w:beforeAutospacing="0" w:after="0" w:afterAutospacing="0"/>
-              <w:rPr>
-                <w:rFonts w:ascii="Arial" w:hAnsi="Arial" w:cs="Arial"/>
-                <w:color w:val="1F1F1F"/>
-              </w:rPr>
-            </w:pPr>
-            <w:r>
-              <w:rPr>
-                <w:rFonts w:ascii="Arial" w:hAnsi="Arial" w:cs="Arial"/>
-                <w:b/>
-                <w:bCs/>
-                <w:color w:val="1F1F1F"/>
-                <w:bdr w:val="none" w:sz="0" w:space="0" w:color="auto" w:frame="1"/>
-              </w:rPr>
-              <w:t>Datos de compra incorrectos</w:t>
-            </w:r>
-          </w:p>
-          <w:p>
-            <w:pPr>
-              <w:rPr>
-                <w:rFonts w:ascii="Arial" w:hAnsi="Arial" w:cs="Arial"/>
-                <w:color w:val="1F1F1F"/>
-                <w:lang w:val="es-ES"/>
-              </w:rPr>
-            </w:pPr>
-            <w:r>
-              <w:rPr>
-                <w:rFonts w:ascii="Arial" w:hAnsi="Arial" w:cs="Arial"/>
-                <w:color w:val="1F1F1F"/>
+                <w:lang w:val="es-ES"/>
+              </w:rPr>
+              <w:t>Esc-4/Carrito</w:t>
+            </w:r>
+          </w:p>
+        </w:tc>
+        <w:tc>
+          <w:tcPr>
+            <w:tcW w:w="0" w:type="auto"/>
+            <w:tcBorders>
+              <w:top w:val="single" w:sz="6" w:space="0" w:color="auto"/>
+              <w:left w:val="single" w:sz="6" w:space="0" w:color="auto"/>
+              <w:bottom w:val="single" w:sz="6" w:space="0" w:color="auto"/>
+              <w:right w:val="single" w:sz="6" w:space="0" w:color="auto"/>
+            </w:tcBorders>
+            <w:tcMar>
+              <w:top w:w="120" w:type="dxa"/>
+              <w:left w:w="180" w:type="dxa"/>
+              <w:bottom w:w="120" w:type="dxa"/>
+              <w:right w:w="180" w:type="dxa"/>
+            </w:tcMar>
+            <w:vAlign w:val="center"/>
+            <w:hideMark/>
+          </w:tcPr>
+          <w:p>
+            <w:pPr>
+              <w:rPr>
+                <w:lang w:val="es-ES"/>
+              </w:rPr>
+            </w:pPr>
+            <w:r>
+              <w:rPr>
+                <w:lang w:val="es-ES"/>
+              </w:rPr>
+              <w:t>Lista de herramientas disponibles</w:t>
+            </w:r>
+          </w:p>
+        </w:tc>
+        <w:tc>
+          <w:tcPr>
+            <w:tcW w:w="0" w:type="auto"/>
+            <w:tcBorders>
+              <w:top w:val="single" w:sz="6" w:space="0" w:color="auto"/>
+              <w:left w:val="single" w:sz="6" w:space="0" w:color="auto"/>
+              <w:bottom w:val="single" w:sz="6" w:space="0" w:color="auto"/>
+              <w:right w:val="single" w:sz="6" w:space="0" w:color="auto"/>
+            </w:tcBorders>
+            <w:tcMar>
+              <w:top w:w="120" w:type="dxa"/>
+              <w:left w:w="180" w:type="dxa"/>
+              <w:bottom w:w="120" w:type="dxa"/>
+              <w:right w:w="180" w:type="dxa"/>
+            </w:tcMar>
+            <w:vAlign w:val="center"/>
+            <w:hideMark/>
+          </w:tcPr>
+          <w:p>
+            <w:pPr>
+              <w:rPr>
+                <w:lang w:val="es-ES"/>
+              </w:rPr>
+            </w:pPr>
+          </w:p>
+        </w:tc>
+        <w:tc>
+          <w:tcPr>
+            <w:tcW w:w="0" w:type="auto"/>
+            <w:tcBorders>
+              <w:top w:val="single" w:sz="6" w:space="0" w:color="auto"/>
+              <w:left w:val="single" w:sz="6" w:space="0" w:color="auto"/>
+              <w:bottom w:val="single" w:sz="6" w:space="0" w:color="auto"/>
+              <w:right w:val="single" w:sz="6" w:space="0" w:color="auto"/>
+            </w:tcBorders>
+            <w:tcMar>
+              <w:top w:w="120" w:type="dxa"/>
+              <w:left w:w="180" w:type="dxa"/>
+              <w:bottom w:w="120" w:type="dxa"/>
+              <w:right w:w="180" w:type="dxa"/>
+            </w:tcMar>
+            <w:vAlign w:val="center"/>
+            <w:hideMark/>
+          </w:tcPr>
+          <w:p>
+            <w:pPr>
+              <w:rPr>
+                <w:lang w:val="es-ES"/>
+              </w:rPr>
+            </w:pPr>
+          </w:p>
+        </w:tc>
+        <w:tc>
+          <w:tcPr>
+            <w:tcW w:w="0" w:type="auto"/>
+            <w:tcBorders>
+              <w:top w:val="single" w:sz="6" w:space="0" w:color="auto"/>
+              <w:left w:val="single" w:sz="6" w:space="0" w:color="auto"/>
+              <w:bottom w:val="single" w:sz="6" w:space="0" w:color="auto"/>
+              <w:right w:val="single" w:sz="6" w:space="0" w:color="auto"/>
+            </w:tcBorders>
+            <w:tcMar>
+              <w:top w:w="120" w:type="dxa"/>
+              <w:left w:w="180" w:type="dxa"/>
+              <w:bottom w:w="120" w:type="dxa"/>
+              <w:right w:w="180" w:type="dxa"/>
+            </w:tcMar>
+            <w:vAlign w:val="center"/>
+            <w:hideMark/>
+          </w:tcPr>
+          <w:p>
+            <w:pPr>
+              <w:rPr>
+                <w:lang w:val="es-ES"/>
+              </w:rPr>
+            </w:pPr>
+          </w:p>
+        </w:tc>
+        <w:tc>
+          <w:tcPr>
+            <w:tcW w:w="0" w:type="auto"/>
+            <w:tcBorders>
+              <w:top w:val="single" w:sz="6" w:space="0" w:color="auto"/>
+              <w:left w:val="single" w:sz="6" w:space="0" w:color="auto"/>
+              <w:bottom w:val="single" w:sz="6" w:space="0" w:color="auto"/>
+              <w:right w:val="single" w:sz="6" w:space="0" w:color="auto"/>
+            </w:tcBorders>
+            <w:tcMar>
+              <w:top w:w="120" w:type="dxa"/>
+              <w:left w:w="180" w:type="dxa"/>
+              <w:bottom w:w="120" w:type="dxa"/>
+              <w:right w:w="180" w:type="dxa"/>
+            </w:tcMar>
+            <w:vAlign w:val="center"/>
+            <w:hideMark/>
+          </w:tcPr>
+          <w:p>
+            <w:pPr>
+              <w:rPr>
+                <w:lang w:val="es-ES"/>
+              </w:rPr>
+            </w:pPr>
+            <w:r>
+              <w:rPr>
+                <w:lang w:val="es-ES"/>
+              </w:rPr>
+              <w:t>(Acción: Añadir Martillo y Destornillador, luego eliminar Martillo)</w:t>
+            </w:r>
+          </w:p>
+        </w:tc>
+        <w:tc>
+          <w:tcPr>
+            <w:tcW w:w="0" w:type="auto"/>
+            <w:tcBorders>
+              <w:top w:val="single" w:sz="6" w:space="0" w:color="auto"/>
+              <w:left w:val="single" w:sz="6" w:space="0" w:color="auto"/>
+              <w:bottom w:val="single" w:sz="6" w:space="0" w:color="auto"/>
+              <w:right w:val="single" w:sz="6" w:space="0" w:color="auto"/>
+            </w:tcBorders>
+            <w:tcMar>
+              <w:top w:w="120" w:type="dxa"/>
+              <w:left w:w="180" w:type="dxa"/>
+              <w:bottom w:w="120" w:type="dxa"/>
+              <w:right w:w="180" w:type="dxa"/>
+            </w:tcMar>
+            <w:vAlign w:val="center"/>
+            <w:hideMark/>
+          </w:tcPr>
+          <w:p>
+            <w:pPr>
+              <w:rPr>
+                <w:lang w:val="es-ES"/>
+              </w:rPr>
+            </w:pPr>
+            <w:r>
+              <w:rPr>
+                <w:lang w:val="es-ES"/>
+              </w:rPr>
+              <w:t>Carrito modificado:</w:t>
+            </w:r>
+          </w:p>
+          <w:p>
+            <w:pPr>
+              <w:rPr>
+                <w:lang w:val="es-ES"/>
+              </w:rPr>
+            </w:pPr>
+            <w:r>
+              <w:rPr>
                 <w:lang w:val="es-ES"/>
               </w:rPr>
               <w:br/>
@@ -2839,99 +4677,19 @@
             </w:pPr>
             <w:r>
               <w:rPr>
-                <w:rFonts w:ascii="Arial" w:hAnsi="Arial" w:cs="Arial"/>
-                <w:color w:val="1F1F1F"/>
-                <w:lang w:val="es-ES"/>
-              </w:rPr>
-              <w:t>(Validación: falta nombre, apellido, etc.)</w:t>
-            </w:r>
-          </w:p>
-        </w:tc>
-        <w:tc>
-          <w:tcPr>
-            <w:tcW w:w="2085" w:type="dxa"/>
-            <w:vAlign w:val="center"/>
-          </w:tcPr>
-          <w:p>
-            <w:pPr>
-              <w:rPr>
-                <w:lang w:val="es-ES"/>
-              </w:rPr>
-            </w:pPr>
-            <w:r>
-              <w:rPr>
-                <w:rFonts w:ascii="Arial" w:hAnsi="Arial" w:cs="Arial"/>
-                <w:b/>
-                <w:bCs/>
-                <w:color w:val="1F1F1F"/>
-                <w:bdr w:val="none" w:sz="0" w:space="0" w:color="auto" w:frame="1"/>
-              </w:rPr>
-              <w:t>FB + FA1</w:t>
-            </w:r>
-          </w:p>
-        </w:tc>
-      </w:tr>
-      <w:tr>
-        <w:tc>
-          <w:tcPr>
-            <w:tcW w:w="1011" w:type="dxa"/>
-            <w:vAlign w:val="center"/>
-          </w:tcPr>
-          <w:p>
-            <w:pPr>
-              <w:rPr>
-                <w:lang w:val="es-ES"/>
-              </w:rPr>
-            </w:pPr>
-            <w:r>
-              <w:rPr>
-                <w:rFonts w:ascii="Arial" w:hAnsi="Arial" w:cs="Arial"/>
-                <w:b/>
-                <w:bCs/>
-                <w:color w:val="1F1F1F"/>
-                <w:bdr w:val="none" w:sz="0" w:space="0" w:color="auto" w:frame="1"/>
-              </w:rPr>
-              <w:t>Esc-4</w:t>
-            </w:r>
-          </w:p>
-        </w:tc>
-        <w:tc>
-          <w:tcPr>
-            <w:tcW w:w="1833" w:type="dxa"/>
-            <w:vAlign w:val="center"/>
-          </w:tcPr>
-          <w:p>
-            <w:pPr>
-              <w:pStyle w:val="NormalWeb"/>
-              <w:spacing w:before="0" w:beforeAutospacing="0" w:after="0" w:afterAutospacing="0"/>
-              <w:rPr>
-                <w:rFonts w:ascii="Arial" w:hAnsi="Arial" w:cs="Arial"/>
-                <w:color w:val="1F1F1F"/>
-              </w:rPr>
-            </w:pPr>
-            <w:r>
-              <w:rPr>
-                <w:rFonts w:ascii="Arial" w:hAnsi="Arial" w:cs="Arial"/>
-                <w:b/>
-                <w:bCs/>
-                <w:color w:val="1F1F1F"/>
-                <w:bdr w:val="none" w:sz="0" w:space="0" w:color="auto" w:frame="1"/>
-              </w:rPr>
-              <w:t>Modificar carrito de compra</w:t>
-            </w:r>
-          </w:p>
-          <w:p>
-            <w:pPr>
-              <w:rPr>
-                <w:rFonts w:ascii="Arial" w:hAnsi="Arial" w:cs="Arial"/>
-                <w:color w:val="1F1F1F"/>
-                <w:lang w:val="es-ES"/>
-              </w:rPr>
-            </w:pPr>
-            <w:r>
-              <w:rPr>
-                <w:rFonts w:ascii="Arial" w:hAnsi="Arial" w:cs="Arial"/>
-                <w:color w:val="1F1F1F"/>
+                <w:lang w:val="es-ES"/>
+              </w:rPr>
+              <w:t>El Martillo desaparece.</w:t>
+            </w:r>
+          </w:p>
+          <w:p>
+            <w:pPr>
+              <w:rPr>
+                <w:lang w:val="es-ES"/>
+              </w:rPr>
+            </w:pPr>
+            <w:r>
+              <w:rPr>
                 <w:lang w:val="es-ES"/>
               </w:rPr>
               <w:br/>
@@ -2945,160 +4703,9 @@
             </w:pPr>
             <w:r>
               <w:rPr>
-                <w:rFonts w:ascii="Arial" w:hAnsi="Arial" w:cs="Arial"/>
-                <w:color w:val="1F1F1F"/>
-                <w:lang w:val="es-ES"/>
-              </w:rPr>
-              <w:t>(Añadir y eliminar herramientas)</w:t>
-            </w:r>
-          </w:p>
-        </w:tc>
-        <w:tc>
-          <w:tcPr>
-            <w:tcW w:w="1748" w:type="dxa"/>
-            <w:vAlign w:val="center"/>
-          </w:tcPr>
-          <w:p>
-            <w:pPr>
-              <w:rPr>
-                <w:lang w:val="es-ES"/>
-              </w:rPr>
-            </w:pPr>
-            <w:r>
-              <w:rPr>
-                <w:rFonts w:ascii="Arial" w:hAnsi="Arial" w:cs="Arial"/>
-                <w:b/>
-                <w:bCs/>
-                <w:color w:val="1F1F1F"/>
-                <w:bdr w:val="none" w:sz="0" w:space="0" w:color="auto" w:frame="1"/>
-              </w:rPr>
-              <w:t>FB + FA2</w:t>
-            </w:r>
-          </w:p>
-        </w:tc>
-        <w:tc>
-          <w:tcPr>
-            <w:tcW w:w="3217" w:type="dxa"/>
-            <w:vAlign w:val="center"/>
-          </w:tcPr>
-          <w:p>
-            <w:pPr>
-              <w:rPr>
-                <w:lang w:val="es-ES"/>
-              </w:rPr>
-            </w:pPr>
-            <w:r>
-              <w:rPr>
-                <w:rStyle w:val="CdigoHTML"/>
-                <w:rFonts w:cs="Arial"/>
-                <w:color w:val="444746"/>
-                <w:bdr w:val="none" w:sz="0" w:space="0" w:color="auto" w:frame="1"/>
-              </w:rPr>
-              <w:t>CU3_FA2_Carrito</w:t>
-            </w:r>
-          </w:p>
-        </w:tc>
-        <w:tc>
-          <w:tcPr>
-            <w:tcW w:w="1113" w:type="dxa"/>
-            <w:vAlign w:val="center"/>
-          </w:tcPr>
-          <w:p>
-            <w:pPr>
-              <w:rPr>
-                <w:lang w:val="es-ES"/>
-              </w:rPr>
-            </w:pPr>
-            <w:r>
-              <w:rPr>
-                <w:rFonts w:ascii="Arial" w:hAnsi="Arial" w:cs="Arial"/>
-                <w:b/>
-                <w:bCs/>
-                <w:color w:val="1F1F1F"/>
-                <w:bdr w:val="none" w:sz="0" w:space="0" w:color="auto" w:frame="1"/>
-              </w:rPr>
-              <w:t>Esc-4</w:t>
-            </w:r>
-          </w:p>
-        </w:tc>
-        <w:tc>
-          <w:tcPr>
-            <w:tcW w:w="1806" w:type="dxa"/>
-            <w:vAlign w:val="center"/>
-          </w:tcPr>
-          <w:p>
-            <w:pPr>
-              <w:pStyle w:val="NormalWeb"/>
-              <w:spacing w:before="0" w:beforeAutospacing="0" w:after="0" w:afterAutospacing="0"/>
-              <w:rPr>
-                <w:rFonts w:ascii="Arial" w:hAnsi="Arial" w:cs="Arial"/>
-                <w:color w:val="1F1F1F"/>
-              </w:rPr>
-            </w:pPr>
-            <w:r>
-              <w:rPr>
-                <w:rFonts w:ascii="Arial" w:hAnsi="Arial" w:cs="Arial"/>
-                <w:b/>
-                <w:bCs/>
-                <w:color w:val="1F1F1F"/>
-                <w:bdr w:val="none" w:sz="0" w:space="0" w:color="auto" w:frame="1"/>
-              </w:rPr>
-              <w:t>Modificar carrito de compra</w:t>
-            </w:r>
-          </w:p>
-          <w:p>
-            <w:pPr>
-              <w:rPr>
-                <w:rFonts w:ascii="Arial" w:hAnsi="Arial" w:cs="Arial"/>
-                <w:color w:val="1F1F1F"/>
-                <w:lang w:val="es-ES"/>
-              </w:rPr>
-            </w:pPr>
-            <w:r>
-              <w:rPr>
-                <w:rFonts w:ascii="Arial" w:hAnsi="Arial" w:cs="Arial"/>
-                <w:color w:val="1F1F1F"/>
-                <w:lang w:val="es-ES"/>
-              </w:rPr>
-              <w:br/>
-            </w:r>
-          </w:p>
-          <w:p>
-            <w:pPr>
-              <w:rPr>
-                <w:lang w:val="es-ES"/>
-              </w:rPr>
-            </w:pPr>
-            <w:r>
-              <w:rPr>
-                <w:rFonts w:ascii="Arial" w:hAnsi="Arial" w:cs="Arial"/>
-                <w:color w:val="1F1F1F"/>
-                <w:lang w:val="es-ES"/>
-              </w:rPr>
-              <w:t>(Añadir y eliminar herramientas)</w:t>
-            </w:r>
-          </w:p>
-        </w:tc>
-        <w:tc>
-          <w:tcPr>
-            <w:tcW w:w="2085" w:type="dxa"/>
-            <w:vAlign w:val="center"/>
-          </w:tcPr>
-          <w:p>
-            <w:pPr>
-              <w:rPr>
-                <w:lang w:val="es-ES"/>
-              </w:rPr>
-            </w:pPr>
-            <w:r>
-              <w:rPr>
-                <w:rFonts w:ascii="Arial" w:hAnsi="Arial" w:cs="Arial"/>
-                <w:b/>
-                <w:bCs/>
-                <w:color w:val="1F1F1F"/>
-                <w:bdr w:val="none" w:sz="0" w:space="0" w:color="auto" w:frame="1"/>
-              </w:rPr>
-              <w:t>FB + FA2</w:t>
+                <w:lang w:val="es-ES"/>
+              </w:rPr>
+              <w:t>El Destornillador permanece.</w:t>
             </w:r>
           </w:p>
         </w:tc>
@@ -3131,7 +4738,6 @@
         <w:rPr>
           <w:lang w:val="es-ES"/>
         </w:rPr>
-        <w:lastRenderedPageBreak/>
         <w:t>Environmental</w:t>
       </w:r>
       <w:proofErr w:type="spellEnd"/>
@@ -3174,7 +4780,8 @@
         <w:overflowPunct w:val="0"/>
         <w:spacing w:line="243" w:lineRule="exact"/>
         <w:rPr>
-          <w:lang w:val="es-ES"/>
+          <w:u w:val="single"/>
+          <w:lang w:val="en-GB"/>
         </w:rPr>
       </w:pPr>
       <w:r>
@@ -3182,14 +4789,44 @@
           <w:spacing w:val="-1"/>
           <w:w w:val="95"/>
         </w:rPr>
-        <w:t>Processor i</w:t>
+        <w:t xml:space="preserve">Processor </w:t>
       </w:r>
       <w:r>
         <w:rPr>
           <w:spacing w:val="-1"/>
           <w:w w:val="95"/>
         </w:rPr>
+        <w:t xml:space="preserve">intel(R) </w:t>
+      </w:r>
+      <w:proofErr w:type="gramStart"/>
+      <w:r>
+        <w:rPr>
+          <w:spacing w:val="-1"/>
+          <w:w w:val="95"/>
+        </w:rPr>
+        <w:t>core(</w:t>
+      </w:r>
+      <w:proofErr w:type="gramEnd"/>
+      <w:r>
+        <w:rPr>
+          <w:spacing w:val="-1"/>
+          <w:w w:val="95"/>
+        </w:rPr>
+        <w:t xml:space="preserve">TM) ultra </w:t>
+      </w:r>
+      <w:r>
+        <w:rPr>
+          <w:spacing w:val="-1"/>
+          <w:w w:val="95"/>
+        </w:rPr>
         <w:t>7</w:t>
+      </w:r>
+      <w:r>
+        <w:rPr>
+          <w:spacing w:val="-1"/>
+          <w:w w:val="95"/>
+        </w:rPr>
+        <w:t xml:space="preserve"> 255HX</w:t>
       </w:r>
       <w:r>
         <w:rPr>
@@ -3438,6 +5075,7 @@
     <w:p>
       <w:pPr>
         <w:rPr>
+          <w:u w:val="single"/>
           <w:lang w:val="en-GB"/>
         </w:rPr>
       </w:pPr>
@@ -4636,6 +6274,7 @@
   <w:style w:type="character" w:default="1" w:styleId="Fuentedeprrafopredeter">
     <w:name w:val="Default Paragraph Font"/>
     <w:uiPriority w:val="1"/>
+    <w:semiHidden/>
     <w:unhideWhenUsed/>
   </w:style>
   <w:style w:type="table" w:default="1" w:styleId="Tablanormal">
@@ -5360,6 +6999,17 @@
 </file>
 
 <file path=customXml/item1.xml><?xml version="1.0" encoding="utf-8"?>
+<p:properties xmlns:p="http://schemas.microsoft.com/office/2006/metadata/properties" xmlns:xsi="http://www.w3.org/2001/XMLSchema-instance" xmlns:pc="http://schemas.microsoft.com/office/infopath/2007/PartnerControls">
+  <documentManagement>
+    <TaxCatchAll xmlns="e70db583-0384-45f2-bee4-d71087a4ae97" xsi:nil="true"/>
+    <lcf76f155ced4ddcb4097134ff3c332f xmlns="d6169a53-58c7-4834-a922-92accc0d3c74">
+      <Terms xmlns="http://schemas.microsoft.com/office/infopath/2007/PartnerControls"/>
+    </lcf76f155ced4ddcb4097134ff3c332f>
+  </documentManagement>
+</p:properties>
+</file>
+
+<file path=customXml/item2.xml><?xml version="1.0" encoding="utf-8"?>
 <ct:contentTypeSchema xmlns:ct="http://schemas.microsoft.com/office/2006/metadata/contentType" xmlns:ma="http://schemas.microsoft.com/office/2006/metadata/properties/metaAttributes" ct:_="" ma:_="" ma:contentTypeName="Documento" ma:contentTypeID="0x010100A84EB69FEAAC124494464A843FB65F1B" ma:contentTypeVersion="16" ma:contentTypeDescription="Crear nuevo documento." ma:contentTypeScope="" ma:versionID="286e5e8eee6bacfcac069fbfa7d104ec">
   <xsd:schema xmlns:xsd="http://www.w3.org/2001/XMLSchema" xmlns:xs="http://www.w3.org/2001/XMLSchema" xmlns:p="http://schemas.microsoft.com/office/2006/metadata/properties" xmlns:ns2="e70db583-0384-45f2-bee4-d71087a4ae97" xmlns:ns3="d6169a53-58c7-4834-a922-92accc0d3c74" targetNamespace="http://schemas.microsoft.com/office/2006/metadata/properties" ma:root="true" ma:fieldsID="0612fa450ef66c14d5f4197a18886f72" ns2:_="" ns3:_="">
     <xsd:import namespace="e70db583-0384-45f2-bee4-d71087a4ae97"/>
@@ -5602,17 +7252,6 @@
 </ct:contentTypeSchema>
 </file>
 
-<file path=customXml/item2.xml><?xml version="1.0" encoding="utf-8"?>
-<p:properties xmlns:p="http://schemas.microsoft.com/office/2006/metadata/properties" xmlns:xsi="http://www.w3.org/2001/XMLSchema-instance" xmlns:pc="http://schemas.microsoft.com/office/infopath/2007/PartnerControls">
-  <documentManagement>
-    <TaxCatchAll xmlns="e70db583-0384-45f2-bee4-d71087a4ae97" xsi:nil="true"/>
-    <lcf76f155ced4ddcb4097134ff3c332f xmlns="d6169a53-58c7-4834-a922-92accc0d3c74">
-      <Terms xmlns="http://schemas.microsoft.com/office/infopath/2007/PartnerControls"/>
-    </lcf76f155ced4ddcb4097134ff3c332f>
-  </documentManagement>
-</p:properties>
-</file>
-
 <file path=customXml/item3.xml><?xml version="1.0" encoding="utf-8"?>
 <?mso-contentType ?>
 <FormTemplates xmlns="http://schemas.microsoft.com/sharepoint/v3/contenttype/forms">
@@ -5623,6 +7262,17 @@
 </file>
 
 <file path=customXml/itemProps1.xml><?xml version="1.0" encoding="utf-8"?>
+<ds:datastoreItem xmlns:ds="http://schemas.openxmlformats.org/officeDocument/2006/customXml" ds:itemID="{1E552648-2456-4AEB-9337-C6642FAB7968}">
+  <ds:schemaRefs>
+    <ds:schemaRef ds:uri="http://schemas.microsoft.com/office/2006/metadata/properties"/>
+    <ds:schemaRef ds:uri="http://schemas.microsoft.com/office/infopath/2007/PartnerControls"/>
+    <ds:schemaRef ds:uri="e70db583-0384-45f2-bee4-d71087a4ae97"/>
+    <ds:schemaRef ds:uri="d6169a53-58c7-4834-a922-92accc0d3c74"/>
+  </ds:schemaRefs>
+</ds:datastoreItem>
+</file>
+
+<file path=customXml/itemProps2.xml><?xml version="1.0" encoding="utf-8"?>
 <ds:datastoreItem xmlns:ds="http://schemas.openxmlformats.org/officeDocument/2006/customXml" ds:itemID="{4A853A0D-0E0A-49AD-A4C8-EC41AF297E80}">
   <ds:schemaRefs>
     <ds:schemaRef ds:uri="http://schemas.microsoft.com/office/2006/metadata/contentType"/>
@@ -5641,17 +7291,6 @@
 </ds:datastoreItem>
 </file>
 
-<file path=customXml/itemProps2.xml><?xml version="1.0" encoding="utf-8"?>
-<ds:datastoreItem xmlns:ds="http://schemas.openxmlformats.org/officeDocument/2006/customXml" ds:itemID="{1E552648-2456-4AEB-9337-C6642FAB7968}">
-  <ds:schemaRefs>
-    <ds:schemaRef ds:uri="http://schemas.microsoft.com/office/2006/metadata/properties"/>
-    <ds:schemaRef ds:uri="http://schemas.microsoft.com/office/infopath/2007/PartnerControls"/>
-    <ds:schemaRef ds:uri="e70db583-0384-45f2-bee4-d71087a4ae97"/>
-    <ds:schemaRef ds:uri="d6169a53-58c7-4834-a922-92accc0d3c74"/>
-  </ds:schemaRefs>
-</ds:datastoreItem>
-</file>
-
 <file path=customXml/itemProps3.xml><?xml version="1.0" encoding="utf-8"?>
 <ds:datastoreItem xmlns:ds="http://schemas.openxmlformats.org/officeDocument/2006/customXml" ds:itemID="{396B05A9-87A0-4E80-9F96-F1F0943B6178}">
   <ds:schemaRefs>

</xml_diff>